<commit_message>
docs: uji coba v1.4 — nama organisasi, kuesioner ramping, JSON fasilitator
Kode sesi+R unik per sesi agar Excel dua perusahaan tidak menumpuk.
Nama organisasi diisi, disamarkan di paper. Form 1/2/3 jadi 11/15/12.
JSON unduhan hanya fasilitator, dikirim ke abduh@itb.ac.id.
</commit_message>
<xml_diff>
--- a/SiapKerja_Draft_Kuesioner.docx
+++ b/SiapKerja_Draft_Kuesioner.docx
@@ -31,7 +31,7 @@
           <w:color w:val="1C1917"/>
           <w:sz w:val="36"/>
         </w:rPr>
-        <w:t>SiapKerja! — tiga formulir uji coba</w:t>
+        <w:t>SiapKerja! — tiga formulir uji coba (ramping)</w:t>
       </w:r>
     </w:p>
     <w:p>
@@ -49,9 +49,11 @@
         </w:rPr>
         <w:t>Objek evaluasi: aplikasi SiapKerja sebagai alat ajar Last Planner System.</w:t>
         <w:br/>
-        <w:t>Bukan penilaian orang, kelompok, atau organisasi.</w:t>
+        <w:t>Bukan penilaian orang atau organisasi. Nama organisasi diisi, disamarkan di paper.</w:t>
         <w:br/>
         <w:t>Buat tiga Microsoft Form terpisah. Jangan digabung.</w:t>
+        <w:br/>
+        <w:t>Gabung Excel: kode sesi + kode R. R unik dalam satu sesi.</w:t>
       </w:r>
     </w:p>
     <w:p>
@@ -93,15 +95,16 @@
         <w:tblLook w:firstColumn="1" w:firstRow="1" w:lastColumn="0" w:lastRow="0" w:noHBand="0" w:noVBand="1" w:val="04A0"/>
       </w:tblPr>
       <w:tblGrid>
-        <w:gridCol w:w="2436"/>
-        <w:gridCol w:w="2436"/>
-        <w:gridCol w:w="2436"/>
-        <w:gridCol w:w="2436"/>
+        <w:gridCol w:w="1949"/>
+        <w:gridCol w:w="1949"/>
+        <w:gridCol w:w="1949"/>
+        <w:gridCol w:w="1949"/>
+        <w:gridCol w:w="1949"/>
       </w:tblGrid>
       <w:tr>
         <w:tc>
           <w:tcPr>
-            <w:tcW w:type="dxa" w:w="2436"/>
+            <w:tcW w:type="dxa" w:w="1949"/>
             <w:shd w:fill="C45C26" w:val="clear"/>
             <w:tcBorders>
               <w:top w:val="single" w:sz="4" w:color="E8E0D5"/>
@@ -129,7 +132,7 @@
         </w:tc>
         <w:tc>
           <w:tcPr>
-            <w:tcW w:type="dxa" w:w="2436"/>
+            <w:tcW w:type="dxa" w:w="1949"/>
             <w:shd w:fill="C45C26" w:val="clear"/>
             <w:tcBorders>
               <w:top w:val="single" w:sz="4" w:color="E8E0D5"/>
@@ -157,7 +160,7 @@
         </w:tc>
         <w:tc>
           <w:tcPr>
-            <w:tcW w:type="dxa" w:w="2436"/>
+            <w:tcW w:type="dxa" w:w="1949"/>
             <w:shd w:fill="C45C26" w:val="clear"/>
             <w:tcBorders>
               <w:top w:val="single" w:sz="4" w:color="E8E0D5"/>
@@ -185,7 +188,7 @@
         </w:tc>
         <w:tc>
           <w:tcPr>
-            <w:tcW w:type="dxa" w:w="2436"/>
+            <w:tcW w:type="dxa" w:w="1949"/>
             <w:shd w:fill="C45C26" w:val="clear"/>
             <w:tcBorders>
               <w:top w:val="single" w:sz="4" w:color="E8E0D5"/>
@@ -211,11 +214,39 @@
             </w:r>
           </w:p>
         </w:tc>
+        <w:tc>
+          <w:tcPr>
+            <w:tcW w:type="dxa" w:w="1949"/>
+            <w:shd w:fill="C45C26" w:val="clear"/>
+            <w:tcBorders>
+              <w:top w:val="single" w:sz="4" w:color="E8E0D5"/>
+              <w:left w:val="single" w:sz="4" w:color="E8E0D5"/>
+              <w:bottom w:val="single" w:sz="4" w:color="E8E0D5"/>
+              <w:right w:val="single" w:sz="4" w:color="E8E0D5"/>
+            </w:tcBorders>
+          </w:tcPr>
+          <w:p>
+            <w:pPr>
+              <w:spacing w:after="40" w:before="40"/>
+            </w:pPr>
+            <w:r/>
+            <w:r>
+              <w:rPr>
+                <w:rFonts w:ascii="Calibri" w:hAnsi="Calibri" w:eastAsia="Calibri"/>
+                <w:b/>
+                <w:i w:val="0"/>
+                <w:color w:val="FFFFFF"/>
+                <w:sz w:val="18"/>
+              </w:rPr>
+              <w:t>Butir</w:t>
+            </w:r>
+          </w:p>
+        </w:tc>
       </w:tr>
       <w:tr>
         <w:tc>
           <w:tcPr>
-            <w:tcW w:type="dxa" w:w="2436"/>
+            <w:tcW w:type="dxa" w:w="1949"/>
             <w:tcBorders>
               <w:top w:val="single" w:sz="4" w:color="E8E0D5"/>
               <w:left w:val="single" w:sz="4" w:color="E8E0D5"/>
@@ -242,7 +273,7 @@
         </w:tc>
         <w:tc>
           <w:tcPr>
-            <w:tcW w:type="dxa" w:w="2436"/>
+            <w:tcW w:type="dxa" w:w="1949"/>
             <w:tcBorders>
               <w:top w:val="single" w:sz="4" w:color="E8E0D5"/>
               <w:left w:val="single" w:sz="4" w:color="E8E0D5"/>
@@ -269,7 +300,7 @@
         </w:tc>
         <w:tc>
           <w:tcPr>
-            <w:tcW w:type="dxa" w:w="2436"/>
+            <w:tcW w:type="dxa" w:w="1949"/>
             <w:tcBorders>
               <w:top w:val="single" w:sz="4" w:color="E8E0D5"/>
               <w:left w:val="single" w:sz="4" w:color="E8E0D5"/>
@@ -296,7 +327,7 @@
         </w:tc>
         <w:tc>
           <w:tcPr>
-            <w:tcW w:type="dxa" w:w="2436"/>
+            <w:tcW w:type="dxa" w:w="1949"/>
             <w:tcBorders>
               <w:top w:val="single" w:sz="4" w:color="E8E0D5"/>
               <w:left w:val="single" w:sz="4" w:color="E8E0D5"/>
@@ -321,11 +352,38 @@
             </w:r>
           </w:p>
         </w:tc>
+        <w:tc>
+          <w:tcPr>
+            <w:tcW w:type="dxa" w:w="1949"/>
+            <w:tcBorders>
+              <w:top w:val="single" w:sz="4" w:color="E8E0D5"/>
+              <w:left w:val="single" w:sz="4" w:color="E8E0D5"/>
+              <w:bottom w:val="single" w:sz="4" w:color="E8E0D5"/>
+              <w:right w:val="single" w:sz="4" w:color="E8E0D5"/>
+            </w:tcBorders>
+          </w:tcPr>
+          <w:p>
+            <w:pPr>
+              <w:spacing w:after="40" w:before="40"/>
+            </w:pPr>
+            <w:r/>
+            <w:r>
+              <w:rPr>
+                <w:rFonts w:ascii="Calibri" w:hAnsi="Calibri" w:eastAsia="Calibri"/>
+                <w:b w:val="0"/>
+                <w:i w:val="0"/>
+                <w:color w:val="1C1917"/>
+                <w:sz w:val="18"/>
+              </w:rPr>
+              <w:t>11</w:t>
+            </w:r>
+          </w:p>
+        </w:tc>
       </w:tr>
       <w:tr>
         <w:tc>
           <w:tcPr>
-            <w:tcW w:type="dxa" w:w="2436"/>
+            <w:tcW w:type="dxa" w:w="1949"/>
             <w:tcBorders>
               <w:top w:val="single" w:sz="4" w:color="E8E0D5"/>
               <w:left w:val="single" w:sz="4" w:color="E8E0D5"/>
@@ -353,7 +411,7 @@
         </w:tc>
         <w:tc>
           <w:tcPr>
-            <w:tcW w:type="dxa" w:w="2436"/>
+            <w:tcW w:type="dxa" w:w="1949"/>
             <w:tcBorders>
               <w:top w:val="single" w:sz="4" w:color="E8E0D5"/>
               <w:left w:val="single" w:sz="4" w:color="E8E0D5"/>
@@ -381,7 +439,7 @@
         </w:tc>
         <w:tc>
           <w:tcPr>
-            <w:tcW w:type="dxa" w:w="2436"/>
+            <w:tcW w:type="dxa" w:w="1949"/>
             <w:tcBorders>
               <w:top w:val="single" w:sz="4" w:color="E8E0D5"/>
               <w:left w:val="single" w:sz="4" w:color="E8E0D5"/>
@@ -403,13 +461,13 @@
                 <w:color w:val="1C1917"/>
                 <w:sz w:val="18"/>
               </w:rPr>
-              <w:t>Peserta yang sama, kode R sama</w:t>
+              <w:t>Peserta yang sama, sesi + R sama</w:t>
             </w:r>
           </w:p>
         </w:tc>
         <w:tc>
           <w:tcPr>
-            <w:tcW w:type="dxa" w:w="2436"/>
+            <w:tcW w:type="dxa" w:w="1949"/>
             <w:tcBorders>
               <w:top w:val="single" w:sz="4" w:color="E8E0D5"/>
               <w:left w:val="single" w:sz="4" w:color="E8E0D5"/>
@@ -435,11 +493,39 @@
             </w:r>
           </w:p>
         </w:tc>
+        <w:tc>
+          <w:tcPr>
+            <w:tcW w:type="dxa" w:w="1949"/>
+            <w:tcBorders>
+              <w:top w:val="single" w:sz="4" w:color="E8E0D5"/>
+              <w:left w:val="single" w:sz="4" w:color="E8E0D5"/>
+              <w:bottom w:val="single" w:sz="4" w:color="E8E0D5"/>
+              <w:right w:val="single" w:sz="4" w:color="E8E0D5"/>
+            </w:tcBorders>
+            <w:shd w:fill="F7F3EE" w:val="clear"/>
+          </w:tcPr>
+          <w:p>
+            <w:pPr>
+              <w:spacing w:after="40" w:before="40"/>
+            </w:pPr>
+            <w:r/>
+            <w:r>
+              <w:rPr>
+                <w:rFonts w:ascii="Calibri" w:hAnsi="Calibri" w:eastAsia="Calibri"/>
+                <w:b w:val="0"/>
+                <w:i w:val="0"/>
+                <w:color w:val="1C1917"/>
+                <w:sz w:val="18"/>
+              </w:rPr>
+              <w:t>15</w:t>
+            </w:r>
+          </w:p>
+        </w:tc>
       </w:tr>
       <w:tr>
         <w:tc>
           <w:tcPr>
-            <w:tcW w:type="dxa" w:w="2436"/>
+            <w:tcW w:type="dxa" w:w="1949"/>
             <w:tcBorders>
               <w:top w:val="single" w:sz="4" w:color="E8E0D5"/>
               <w:left w:val="single" w:sz="4" w:color="E8E0D5"/>
@@ -466,7 +552,7 @@
         </w:tc>
         <w:tc>
           <w:tcPr>
-            <w:tcW w:type="dxa" w:w="2436"/>
+            <w:tcW w:type="dxa" w:w="1949"/>
             <w:tcBorders>
               <w:top w:val="single" w:sz="4" w:color="E8E0D5"/>
               <w:left w:val="single" w:sz="4" w:color="E8E0D5"/>
@@ -493,7 +579,7 @@
         </w:tc>
         <w:tc>
           <w:tcPr>
-            <w:tcW w:type="dxa" w:w="2436"/>
+            <w:tcW w:type="dxa" w:w="1949"/>
             <w:tcBorders>
               <w:top w:val="single" w:sz="4" w:color="E8E0D5"/>
               <w:left w:val="single" w:sz="4" w:color="E8E0D5"/>
@@ -514,13 +600,13 @@
                 <w:color w:val="1C1917"/>
                 <w:sz w:val="18"/>
               </w:rPr>
-              <w:t>Fasilitator, satu isian per kelompok</w:t>
+              <w:t>Fasilitator, satu isian per laptop</w:t>
             </w:r>
           </w:p>
         </w:tc>
         <w:tc>
           <w:tcPr>
-            <w:tcW w:type="dxa" w:w="2436"/>
+            <w:tcW w:type="dxa" w:w="1949"/>
             <w:tcBorders>
               <w:top w:val="single" w:sz="4" w:color="E8E0D5"/>
               <w:left w:val="single" w:sz="4" w:color="E8E0D5"/>
@@ -545,6 +631,33 @@
             </w:r>
           </w:p>
         </w:tc>
+        <w:tc>
+          <w:tcPr>
+            <w:tcW w:type="dxa" w:w="1949"/>
+            <w:tcBorders>
+              <w:top w:val="single" w:sz="4" w:color="E8E0D5"/>
+              <w:left w:val="single" w:sz="4" w:color="E8E0D5"/>
+              <w:bottom w:val="single" w:sz="4" w:color="E8E0D5"/>
+              <w:right w:val="single" w:sz="4" w:color="E8E0D5"/>
+            </w:tcBorders>
+          </w:tcPr>
+          <w:p>
+            <w:pPr>
+              <w:spacing w:after="40" w:before="40"/>
+            </w:pPr>
+            <w:r/>
+            <w:r>
+              <w:rPr>
+                <w:rFonts w:ascii="Calibri" w:hAnsi="Calibri" w:eastAsia="Calibri"/>
+                <w:b w:val="0"/>
+                <w:i w:val="0"/>
+                <w:color w:val="1C1917"/>
+                <w:sz w:val="18"/>
+              </w:rPr>
+              <w:t>12</w:t>
+            </w:r>
+          </w:p>
+        </w:tc>
       </w:tr>
     </w:tbl>
     <w:p>
@@ -564,7 +677,7 @@
           <w:color w:val="57534E"/>
           <w:sz w:val="20"/>
         </w:rPr>
-        <w:t>Langkah unggah: SiapKerja_MSForms_CaraUnggah.md. Skala Likert Form 1 &amp; 2: 1 = sangat tidak setuju · 2 = tidak setuju · 3 = netral · 4 = setuju · 5 = sangat setuju. Kode R (contoh R07) harus sama di Form 1 dan Form 2. Jangan minta nama orang atau nama instansi.</w:t>
+        <w:t>Langkah unggah: SiapKerja_MSForms_CaraUnggah.md. Skala Likert Form 1 &amp; 2: 1 = sangat tidak setuju · 5 = sangat setuju. Empat butir LPS di Form 1 no. 8–11 wajib diulang identik di Form 2 no. 8–11. Jangan minta nama orang. Nama organisasi diisi, disamarkan di paper.</w:t>
       </w:r>
     </w:p>
     <w:p>
@@ -580,7 +693,7 @@
           <w:color w:val="9A4519"/>
           <w:sz w:val="28"/>
         </w:rPr>
-        <w:t>Form 1 — Pra-simulasi</w:t>
+        <w:t>Form 1 — Pra-simulasi (11 butir)</w:t>
       </w:r>
     </w:p>
     <w:p>
@@ -620,7 +733,7 @@
           <w:color w:val="1C1917"/>
           <w:sz w:val="22"/>
         </w:rPr>
-        <w:t>Isi sebelum memulai simulator SiapKerja. Kami mengevaluasi aplikasi, bukan menilai Anda. Jangan tulis nama orang atau nama instansi. Kode R (contoh R07) dan kelompok G (contoh G2) diberikan fasilitator. 1 = sangat tidak setuju, 5 = sangat setuju.</w:t>
+        <w:t>Isi sebelum memulai simulator SiapKerja. Kami mengevaluasi aplikasi, bukan menilai Anda. Jangan tulis nama orang. Nama organisasi atau perusahaan diisi apa adanya; di paper akan disamarkan. Kode sesi, R, dan G diberikan fasilitator. R unik dalam sesi ini. 1 = sangat tidak setuju, 5 = sangat setuju.</w:t>
       </w:r>
     </w:p>
     <w:tbl>
@@ -801,7 +914,7 @@
                 <w:color w:val="1C1917"/>
                 <w:sz w:val="18"/>
               </w:rPr>
-              <w:t>Kode responden (contoh R07)</w:t>
+              <w:t>Kode sesi (contoh S260901-A)</w:t>
             </w:r>
           </w:p>
         </w:tc>
@@ -913,7 +1026,7 @@
                 <w:color w:val="1C1917"/>
                 <w:sz w:val="18"/>
               </w:rPr>
-              <w:t>Kode kelompok (contoh G2)</w:t>
+              <w:t>Kode responden, unik dalam sesi ini (contoh R07)</w:t>
             </w:r>
           </w:p>
         </w:tc>
@@ -1025,7 +1138,231 @@
                 <w:color w:val="1C1917"/>
                 <w:sz w:val="18"/>
               </w:rPr>
-              <w:t>Jenis organisasi Anda (jangan tulis nama instansi)</w:t>
+              <w:t>Kode kelompok / laptop (contoh G2)</w:t>
+            </w:r>
+          </w:p>
+        </w:tc>
+        <w:tc>
+          <w:tcPr>
+            <w:tcW w:type="dxa" w:w="2436"/>
+            <w:tcBorders>
+              <w:top w:val="single" w:sz="4" w:color="E8E0D5"/>
+              <w:left w:val="single" w:sz="4" w:color="E8E0D5"/>
+              <w:bottom w:val="single" w:sz="4" w:color="E8E0D5"/>
+              <w:right w:val="single" w:sz="4" w:color="E8E0D5"/>
+            </w:tcBorders>
+          </w:tcPr>
+          <w:p>
+            <w:pPr>
+              <w:spacing w:after="40" w:before="40"/>
+            </w:pPr>
+            <w:r/>
+            <w:r>
+              <w:rPr>
+                <w:rFonts w:ascii="Calibri" w:hAnsi="Calibri" w:eastAsia="Calibri"/>
+                <w:b w:val="0"/>
+                <w:i w:val="0"/>
+                <w:color w:val="1C1917"/>
+                <w:sz w:val="18"/>
+              </w:rPr>
+              <w:t>isian singkat</w:t>
+            </w:r>
+          </w:p>
+        </w:tc>
+        <w:tc>
+          <w:tcPr>
+            <w:tcW w:type="dxa" w:w="2436"/>
+            <w:tcBorders>
+              <w:top w:val="single" w:sz="4" w:color="E8E0D5"/>
+              <w:left w:val="single" w:sz="4" w:color="E8E0D5"/>
+              <w:bottom w:val="single" w:sz="4" w:color="E8E0D5"/>
+              <w:right w:val="single" w:sz="4" w:color="E8E0D5"/>
+            </w:tcBorders>
+          </w:tcPr>
+          <w:p>
+            <w:pPr>
+              <w:spacing w:after="40" w:before="40"/>
+            </w:pPr>
+            <w:r/>
+            <w:r>
+              <w:rPr>
+                <w:rFonts w:ascii="Calibri" w:hAnsi="Calibri" w:eastAsia="Calibri"/>
+                <w:b w:val="0"/>
+                <w:i w:val="0"/>
+                <w:color w:val="1C1917"/>
+                <w:sz w:val="18"/>
+              </w:rPr>
+              <w:t>ya</w:t>
+            </w:r>
+          </w:p>
+        </w:tc>
+      </w:tr>
+      <w:tr>
+        <w:tc>
+          <w:tcPr>
+            <w:tcW w:type="dxa" w:w="2436"/>
+            <w:tcBorders>
+              <w:top w:val="single" w:sz="4" w:color="E8E0D5"/>
+              <w:left w:val="single" w:sz="4" w:color="E8E0D5"/>
+              <w:bottom w:val="single" w:sz="4" w:color="E8E0D5"/>
+              <w:right w:val="single" w:sz="4" w:color="E8E0D5"/>
+            </w:tcBorders>
+            <w:shd w:fill="F7F3EE" w:val="clear"/>
+          </w:tcPr>
+          <w:p>
+            <w:pPr>
+              <w:spacing w:after="40" w:before="40"/>
+            </w:pPr>
+            <w:r/>
+            <w:r>
+              <w:rPr>
+                <w:rFonts w:ascii="Calibri" w:hAnsi="Calibri" w:eastAsia="Calibri"/>
+                <w:b w:val="0"/>
+                <w:i w:val="0"/>
+                <w:color w:val="1C1917"/>
+                <w:sz w:val="18"/>
+              </w:rPr>
+              <w:t>4</w:t>
+            </w:r>
+          </w:p>
+        </w:tc>
+        <w:tc>
+          <w:tcPr>
+            <w:tcW w:type="dxa" w:w="2436"/>
+            <w:tcBorders>
+              <w:top w:val="single" w:sz="4" w:color="E8E0D5"/>
+              <w:left w:val="single" w:sz="4" w:color="E8E0D5"/>
+              <w:bottom w:val="single" w:sz="4" w:color="E8E0D5"/>
+              <w:right w:val="single" w:sz="4" w:color="E8E0D5"/>
+            </w:tcBorders>
+            <w:shd w:fill="F7F3EE" w:val="clear"/>
+          </w:tcPr>
+          <w:p>
+            <w:pPr>
+              <w:spacing w:after="40" w:before="40"/>
+            </w:pPr>
+            <w:r/>
+            <w:r>
+              <w:rPr>
+                <w:rFonts w:ascii="Calibri" w:hAnsi="Calibri" w:eastAsia="Calibri"/>
+                <w:b w:val="0"/>
+                <w:i w:val="0"/>
+                <w:color w:val="1C1917"/>
+                <w:sz w:val="18"/>
+              </w:rPr>
+              <w:t>Nama organisasi atau perusahaan. Di paper akan disamarkan. Jika tidak mewakili organisasi, tulis Individu.</w:t>
+            </w:r>
+          </w:p>
+        </w:tc>
+        <w:tc>
+          <w:tcPr>
+            <w:tcW w:type="dxa" w:w="2436"/>
+            <w:tcBorders>
+              <w:top w:val="single" w:sz="4" w:color="E8E0D5"/>
+              <w:left w:val="single" w:sz="4" w:color="E8E0D5"/>
+              <w:bottom w:val="single" w:sz="4" w:color="E8E0D5"/>
+              <w:right w:val="single" w:sz="4" w:color="E8E0D5"/>
+            </w:tcBorders>
+            <w:shd w:fill="F7F3EE" w:val="clear"/>
+          </w:tcPr>
+          <w:p>
+            <w:pPr>
+              <w:spacing w:after="40" w:before="40"/>
+            </w:pPr>
+            <w:r/>
+            <w:r>
+              <w:rPr>
+                <w:rFonts w:ascii="Calibri" w:hAnsi="Calibri" w:eastAsia="Calibri"/>
+                <w:b w:val="0"/>
+                <w:i w:val="0"/>
+                <w:color w:val="1C1917"/>
+                <w:sz w:val="18"/>
+              </w:rPr>
+              <w:t>isian singkat</w:t>
+            </w:r>
+          </w:p>
+        </w:tc>
+        <w:tc>
+          <w:tcPr>
+            <w:tcW w:type="dxa" w:w="2436"/>
+            <w:tcBorders>
+              <w:top w:val="single" w:sz="4" w:color="E8E0D5"/>
+              <w:left w:val="single" w:sz="4" w:color="E8E0D5"/>
+              <w:bottom w:val="single" w:sz="4" w:color="E8E0D5"/>
+              <w:right w:val="single" w:sz="4" w:color="E8E0D5"/>
+            </w:tcBorders>
+            <w:shd w:fill="F7F3EE" w:val="clear"/>
+          </w:tcPr>
+          <w:p>
+            <w:pPr>
+              <w:spacing w:after="40" w:before="40"/>
+            </w:pPr>
+            <w:r/>
+            <w:r>
+              <w:rPr>
+                <w:rFonts w:ascii="Calibri" w:hAnsi="Calibri" w:eastAsia="Calibri"/>
+                <w:b w:val="0"/>
+                <w:i w:val="0"/>
+                <w:color w:val="1C1917"/>
+                <w:sz w:val="18"/>
+              </w:rPr>
+              <w:t>ya</w:t>
+            </w:r>
+          </w:p>
+        </w:tc>
+      </w:tr>
+      <w:tr>
+        <w:tc>
+          <w:tcPr>
+            <w:tcW w:type="dxa" w:w="2436"/>
+            <w:tcBorders>
+              <w:top w:val="single" w:sz="4" w:color="E8E0D5"/>
+              <w:left w:val="single" w:sz="4" w:color="E8E0D5"/>
+              <w:bottom w:val="single" w:sz="4" w:color="E8E0D5"/>
+              <w:right w:val="single" w:sz="4" w:color="E8E0D5"/>
+            </w:tcBorders>
+          </w:tcPr>
+          <w:p>
+            <w:pPr>
+              <w:spacing w:after="40" w:before="40"/>
+            </w:pPr>
+            <w:r/>
+            <w:r>
+              <w:rPr>
+                <w:rFonts w:ascii="Calibri" w:hAnsi="Calibri" w:eastAsia="Calibri"/>
+                <w:b w:val="0"/>
+                <w:i w:val="0"/>
+                <w:color w:val="1C1917"/>
+                <w:sz w:val="18"/>
+              </w:rPr>
+              <w:t>5</w:t>
+            </w:r>
+          </w:p>
+        </w:tc>
+        <w:tc>
+          <w:tcPr>
+            <w:tcW w:type="dxa" w:w="2436"/>
+            <w:tcBorders>
+              <w:top w:val="single" w:sz="4" w:color="E8E0D5"/>
+              <w:left w:val="single" w:sz="4" w:color="E8E0D5"/>
+              <w:bottom w:val="single" w:sz="4" w:color="E8E0D5"/>
+              <w:right w:val="single" w:sz="4" w:color="E8E0D5"/>
+            </w:tcBorders>
+          </w:tcPr>
+          <w:p>
+            <w:pPr>
+              <w:spacing w:after="40" w:before="40"/>
+            </w:pPr>
+            <w:r/>
+            <w:r>
+              <w:rPr>
+                <w:rFonts w:ascii="Calibri" w:hAnsi="Calibri" w:eastAsia="Calibri"/>
+                <w:b w:val="0"/>
+                <w:i w:val="0"/>
+                <w:color w:val="1C1917"/>
+                <w:sz w:val="18"/>
+              </w:rPr>
+              <w:t>Jenis organisasi Anda</w:t>
             </w:r>
           </w:p>
         </w:tc>
@@ -1109,7 +1446,7 @@
                 <w:color w:val="1C1917"/>
                 <w:sz w:val="18"/>
               </w:rPr>
-              <w:t>4</w:t>
+              <w:t>6</w:t>
             </w:r>
           </w:p>
         </w:tc>
@@ -1222,7 +1559,7 @@
                 <w:color w:val="1C1917"/>
                 <w:sz w:val="18"/>
               </w:rPr>
-              <w:t>5</w:t>
+              <w:t>7</w:t>
             </w:r>
           </w:p>
         </w:tc>
@@ -1249,7 +1586,7 @@
                 <w:color w:val="1C1917"/>
                 <w:sz w:val="18"/>
               </w:rPr>
-              <w:t>Pengalaman kerja konstruksi</w:t>
+              <w:t>Pernah menjalankan Last Planner System di proyek nyata?</w:t>
             </w:r>
           </w:p>
         </w:tc>
@@ -1276,7 +1613,7 @@
                 <w:color w:val="1C1917"/>
                 <w:sz w:val="18"/>
               </w:rPr>
-              <w:t>pilihan: Belum bekerja di konstruksi / Kurang dari 3 tahun / 3 sampai 7 tahun / 8 sampai 15 tahun / Lebih dari 15 tahun</w:t>
+              <w:t>pilihan: Tidak / Pernah melihat / Pernah menjalankan</w:t>
             </w:r>
           </w:p>
         </w:tc>
@@ -1333,7 +1670,6 @@
                 <w:color w:val="1C1917"/>
                 <w:sz w:val="18"/>
               </w:rPr>
-              <w:t>6</w:t>
             </w:r>
           </w:p>
         </w:tc>
@@ -1361,7 +1697,7 @@
                 <w:color w:val="1C1917"/>
                 <w:sz w:val="18"/>
               </w:rPr>
-              <w:t>Pernah menjalankan Last Planner System di proyek nyata?</w:t>
+              <w:t>Empat butir LPS (wajib tetap, diulang di Form 2)</w:t>
             </w:r>
           </w:p>
         </w:tc>
@@ -1389,7 +1725,6 @@
                 <w:color w:val="1C1917"/>
                 <w:sz w:val="18"/>
               </w:rPr>
-              <w:t>pilihan: Tidak / Pernah melihat / Pernah menjalankan</w:t>
             </w:r>
           </w:p>
         </w:tc>
@@ -1417,7 +1752,6 @@
                 <w:color w:val="1C1917"/>
                 <w:sz w:val="18"/>
               </w:rPr>
-              <w:t>ya</w:t>
             </w:r>
           </w:p>
         </w:tc>
@@ -1446,7 +1780,7 @@
                 <w:color w:val="1C1917"/>
                 <w:sz w:val="18"/>
               </w:rPr>
-              <w:t>7</w:t>
+              <w:t>8</w:t>
             </w:r>
           </w:p>
         </w:tc>
@@ -1473,231 +1807,7 @@
                 <w:color w:val="1C1917"/>
                 <w:sz w:val="18"/>
               </w:rPr>
-              <w:t>Seberapa familiar Anda dengan istilah LPS (last planner, pull, make-ready, PPC)?</w:t>
-            </w:r>
-          </w:p>
-        </w:tc>
-        <w:tc>
-          <w:tcPr>
-            <w:tcW w:type="dxa" w:w="2436"/>
-            <w:tcBorders>
-              <w:top w:val="single" w:sz="4" w:color="E8E0D5"/>
-              <w:left w:val="single" w:sz="4" w:color="E8E0D5"/>
-              <w:bottom w:val="single" w:sz="4" w:color="E8E0D5"/>
-              <w:right w:val="single" w:sz="4" w:color="E8E0D5"/>
-            </w:tcBorders>
-          </w:tcPr>
-          <w:p>
-            <w:pPr>
-              <w:spacing w:after="40" w:before="40"/>
-            </w:pPr>
-            <w:r/>
-            <w:r>
-              <w:rPr>
-                <w:rFonts w:ascii="Calibri" w:hAnsi="Calibri" w:eastAsia="Calibri"/>
-                <w:b w:val="0"/>
-                <w:i w:val="0"/>
-                <w:color w:val="1C1917"/>
-                <w:sz w:val="18"/>
-              </w:rPr>
-              <w:t>pilihan: Belum pernah mendengar / Pernah mendengar / Pernah dipelajari di kelas atau kantor / Pernah dipakai di lapangan</w:t>
-            </w:r>
-          </w:p>
-        </w:tc>
-        <w:tc>
-          <w:tcPr>
-            <w:tcW w:type="dxa" w:w="2436"/>
-            <w:tcBorders>
-              <w:top w:val="single" w:sz="4" w:color="E8E0D5"/>
-              <w:left w:val="single" w:sz="4" w:color="E8E0D5"/>
-              <w:bottom w:val="single" w:sz="4" w:color="E8E0D5"/>
-              <w:right w:val="single" w:sz="4" w:color="E8E0D5"/>
-            </w:tcBorders>
-          </w:tcPr>
-          <w:p>
-            <w:pPr>
-              <w:spacing w:after="40" w:before="40"/>
-            </w:pPr>
-            <w:r/>
-            <w:r>
-              <w:rPr>
-                <w:rFonts w:ascii="Calibri" w:hAnsi="Calibri" w:eastAsia="Calibri"/>
-                <w:b w:val="0"/>
-                <w:i w:val="0"/>
-                <w:color w:val="1C1917"/>
-                <w:sz w:val="18"/>
-              </w:rPr>
-              <w:t>ya</w:t>
-            </w:r>
-          </w:p>
-        </w:tc>
-      </w:tr>
-      <w:tr>
-        <w:tc>
-          <w:tcPr>
-            <w:tcW w:type="dxa" w:w="2436"/>
-            <w:tcBorders>
-              <w:top w:val="single" w:sz="4" w:color="E8E0D5"/>
-              <w:left w:val="single" w:sz="4" w:color="E8E0D5"/>
-              <w:bottom w:val="single" w:sz="4" w:color="E8E0D5"/>
-              <w:right w:val="single" w:sz="4" w:color="E8E0D5"/>
-            </w:tcBorders>
-            <w:shd w:fill="F7F3EE" w:val="clear"/>
-          </w:tcPr>
-          <w:p>
-            <w:pPr>
-              <w:spacing w:after="40" w:before="40"/>
-            </w:pPr>
-            <w:r/>
-            <w:r>
-              <w:rPr>
-                <w:rFonts w:ascii="Calibri" w:hAnsi="Calibri" w:eastAsia="Calibri"/>
-                <w:b w:val="0"/>
-                <w:i w:val="0"/>
-                <w:color w:val="1C1917"/>
-                <w:sz w:val="18"/>
-              </w:rPr>
-              <w:t>8</w:t>
-            </w:r>
-          </w:p>
-        </w:tc>
-        <w:tc>
-          <w:tcPr>
-            <w:tcW w:type="dxa" w:w="2436"/>
-            <w:tcBorders>
-              <w:top w:val="single" w:sz="4" w:color="E8E0D5"/>
-              <w:left w:val="single" w:sz="4" w:color="E8E0D5"/>
-              <w:bottom w:val="single" w:sz="4" w:color="E8E0D5"/>
-              <w:right w:val="single" w:sz="4" w:color="E8E0D5"/>
-            </w:tcBorders>
-            <w:shd w:fill="F7F3EE" w:val="clear"/>
-          </w:tcPr>
-          <w:p>
-            <w:pPr>
-              <w:spacing w:after="40" w:before="40"/>
-            </w:pPr>
-            <w:r/>
-            <w:r>
-              <w:rPr>
-                <w:rFonts w:ascii="Calibri" w:hAnsi="Calibri" w:eastAsia="Calibri"/>
-                <w:b w:val="0"/>
-                <w:i w:val="0"/>
-                <w:color w:val="1C1917"/>
-                <w:sz w:val="18"/>
-              </w:rPr>
-              <w:t>Bagaimana pekerjaan mingguan biasanya direncanakan di tempat Anda bekerja atau belajar?</w:t>
-            </w:r>
-          </w:p>
-        </w:tc>
-        <w:tc>
-          <w:tcPr>
-            <w:tcW w:type="dxa" w:w="2436"/>
-            <w:tcBorders>
-              <w:top w:val="single" w:sz="4" w:color="E8E0D5"/>
-              <w:left w:val="single" w:sz="4" w:color="E8E0D5"/>
-              <w:bottom w:val="single" w:sz="4" w:color="E8E0D5"/>
-              <w:right w:val="single" w:sz="4" w:color="E8E0D5"/>
-            </w:tcBorders>
-            <w:shd w:fill="F7F3EE" w:val="clear"/>
-          </w:tcPr>
-          <w:p>
-            <w:pPr>
-              <w:spacing w:after="40" w:before="40"/>
-            </w:pPr>
-            <w:r/>
-            <w:r>
-              <w:rPr>
-                <w:rFonts w:ascii="Calibri" w:hAnsi="Calibri" w:eastAsia="Calibri"/>
-                <w:b w:val="0"/>
-                <w:i w:val="0"/>
-                <w:color w:val="1C1917"/>
-                <w:sz w:val="18"/>
-              </w:rPr>
-              <w:t>pilihan: Jadwal induk atau Gantt / Rapat lapangan informal / Sudah memakai LPS / Belum bekerja atau belajar di lapangan / Lainnya</w:t>
-            </w:r>
-          </w:p>
-        </w:tc>
-        <w:tc>
-          <w:tcPr>
-            <w:tcW w:type="dxa" w:w="2436"/>
-            <w:tcBorders>
-              <w:top w:val="single" w:sz="4" w:color="E8E0D5"/>
-              <w:left w:val="single" w:sz="4" w:color="E8E0D5"/>
-              <w:bottom w:val="single" w:sz="4" w:color="E8E0D5"/>
-              <w:right w:val="single" w:sz="4" w:color="E8E0D5"/>
-            </w:tcBorders>
-            <w:shd w:fill="F7F3EE" w:val="clear"/>
-          </w:tcPr>
-          <w:p>
-            <w:pPr>
-              <w:spacing w:after="40" w:before="40"/>
-            </w:pPr>
-            <w:r/>
-            <w:r>
-              <w:rPr>
-                <w:rFonts w:ascii="Calibri" w:hAnsi="Calibri" w:eastAsia="Calibri"/>
-                <w:b w:val="0"/>
-                <w:i w:val="0"/>
-                <w:color w:val="1C1917"/>
-                <w:sz w:val="18"/>
-              </w:rPr>
-              <w:t>ya</w:t>
-            </w:r>
-          </w:p>
-        </w:tc>
-      </w:tr>
-      <w:tr>
-        <w:tc>
-          <w:tcPr>
-            <w:tcW w:type="dxa" w:w="2436"/>
-            <w:tcBorders>
-              <w:top w:val="single" w:sz="4" w:color="E8E0D5"/>
-              <w:left w:val="single" w:sz="4" w:color="E8E0D5"/>
-              <w:bottom w:val="single" w:sz="4" w:color="E8E0D5"/>
-              <w:right w:val="single" w:sz="4" w:color="E8E0D5"/>
-            </w:tcBorders>
-          </w:tcPr>
-          <w:p>
-            <w:pPr>
-              <w:spacing w:after="40" w:before="40"/>
-            </w:pPr>
-            <w:r/>
-            <w:r>
-              <w:rPr>
-                <w:rFonts w:ascii="Calibri" w:hAnsi="Calibri" w:eastAsia="Calibri"/>
-                <w:b w:val="0"/>
-                <w:i w:val="0"/>
-                <w:color w:val="1C1917"/>
-                <w:sz w:val="18"/>
-              </w:rPr>
-              <w:t>9</w:t>
-            </w:r>
-          </w:p>
-        </w:tc>
-        <w:tc>
-          <w:tcPr>
-            <w:tcW w:type="dxa" w:w="2436"/>
-            <w:tcBorders>
-              <w:top w:val="single" w:sz="4" w:color="E8E0D5"/>
-              <w:left w:val="single" w:sz="4" w:color="E8E0D5"/>
-              <w:bottom w:val="single" w:sz="4" w:color="E8E0D5"/>
-              <w:right w:val="single" w:sz="4" w:color="E8E0D5"/>
-            </w:tcBorders>
-          </w:tcPr>
-          <w:p>
-            <w:pPr>
-              <w:spacing w:after="40" w:before="40"/>
-            </w:pPr>
-            <w:r/>
-            <w:r>
-              <w:rPr>
-                <w:rFonts w:ascii="Calibri" w:hAnsi="Calibri" w:eastAsia="Calibri"/>
-                <w:b w:val="0"/>
-                <w:i w:val="0"/>
-                <w:color w:val="1C1917"/>
-                <w:sz w:val="18"/>
-              </w:rPr>
-              <w:t>Jadwal induk (Gantt/CPM) sudah cukup untuk mengendalikan produksi mingguan.</w:t>
+              <w:t>Pekerjaan minggu depan boleh dijanjikan meskipun masih ada kendala yang belum dilepas.</w:t>
             </w:r>
           </w:p>
         </w:tc>
@@ -1781,7 +1891,7 @@
                 <w:color w:val="1C1917"/>
                 <w:sz w:val="18"/>
               </w:rPr>
-              <w:t>10</w:t>
+              <w:t>9</w:t>
             </w:r>
           </w:p>
         </w:tc>
@@ -1809,7 +1919,7 @@
                 <w:color w:val="1C1917"/>
                 <w:sz w:val="18"/>
               </w:rPr>
-              <w:t>Pekerjaan minggu depan boleh dijanjikan meskipun masih ada kendala yang belum dilepas.</w:t>
+              <w:t>Pull berarti memulai setiap kegiatan seawal mungkin sesuai jadwal induk.</w:t>
             </w:r>
           </w:p>
         </w:tc>
@@ -1894,7 +2004,7 @@
                 <w:color w:val="1C1917"/>
                 <w:sz w:val="18"/>
               </w:rPr>
-              <w:t>11</w:t>
+              <w:t>10</w:t>
             </w:r>
           </w:p>
         </w:tc>
@@ -1921,7 +2031,7 @@
                 <w:color w:val="1C1917"/>
                 <w:sz w:val="18"/>
               </w:rPr>
-              <w:t>Last planner adalah orang yang paling dekat dengan pekerjaan, bukan hanya planner di kantor lapangan.</w:t>
+              <w:t>PPC mengukur seberapa cepat bangunan diselesaikan.</w:t>
             </w:r>
           </w:p>
         </w:tc>
@@ -2005,231 +2115,7 @@
                 <w:color w:val="1C1917"/>
                 <w:sz w:val="18"/>
               </w:rPr>
-              <w:t>12</w:t>
-            </w:r>
-          </w:p>
-        </w:tc>
-        <w:tc>
-          <w:tcPr>
-            <w:tcW w:type="dxa" w:w="2436"/>
-            <w:tcBorders>
-              <w:top w:val="single" w:sz="4" w:color="E8E0D5"/>
-              <w:left w:val="single" w:sz="4" w:color="E8E0D5"/>
-              <w:bottom w:val="single" w:sz="4" w:color="E8E0D5"/>
-              <w:right w:val="single" w:sz="4" w:color="E8E0D5"/>
-            </w:tcBorders>
-            <w:shd w:fill="F7F3EE" w:val="clear"/>
-          </w:tcPr>
-          <w:p>
-            <w:pPr>
-              <w:spacing w:after="40" w:before="40"/>
-            </w:pPr>
-            <w:r/>
-            <w:r>
-              <w:rPr>
-                <w:rFonts w:ascii="Calibri" w:hAnsi="Calibri" w:eastAsia="Calibri"/>
-                <w:b w:val="0"/>
-                <w:i w:val="0"/>
-                <w:color w:val="1C1917"/>
-                <w:sz w:val="18"/>
-              </w:rPr>
-              <w:t>PPC mengukur seberapa cepat bangunan diselesaikan.</w:t>
-            </w:r>
-          </w:p>
-        </w:tc>
-        <w:tc>
-          <w:tcPr>
-            <w:tcW w:type="dxa" w:w="2436"/>
-            <w:tcBorders>
-              <w:top w:val="single" w:sz="4" w:color="E8E0D5"/>
-              <w:left w:val="single" w:sz="4" w:color="E8E0D5"/>
-              <w:bottom w:val="single" w:sz="4" w:color="E8E0D5"/>
-              <w:right w:val="single" w:sz="4" w:color="E8E0D5"/>
-            </w:tcBorders>
-            <w:shd w:fill="F7F3EE" w:val="clear"/>
-          </w:tcPr>
-          <w:p>
-            <w:pPr>
-              <w:spacing w:after="40" w:before="40"/>
-            </w:pPr>
-            <w:r/>
-            <w:r>
-              <w:rPr>
-                <w:rFonts w:ascii="Calibri" w:hAnsi="Calibri" w:eastAsia="Calibri"/>
-                <w:b w:val="0"/>
-                <w:i w:val="0"/>
-                <w:color w:val="1C1917"/>
-                <w:sz w:val="18"/>
-              </w:rPr>
-              <w:t>Likert 1–5</w:t>
-            </w:r>
-          </w:p>
-        </w:tc>
-        <w:tc>
-          <w:tcPr>
-            <w:tcW w:type="dxa" w:w="2436"/>
-            <w:tcBorders>
-              <w:top w:val="single" w:sz="4" w:color="E8E0D5"/>
-              <w:left w:val="single" w:sz="4" w:color="E8E0D5"/>
-              <w:bottom w:val="single" w:sz="4" w:color="E8E0D5"/>
-              <w:right w:val="single" w:sz="4" w:color="E8E0D5"/>
-            </w:tcBorders>
-            <w:shd w:fill="F7F3EE" w:val="clear"/>
-          </w:tcPr>
-          <w:p>
-            <w:pPr>
-              <w:spacing w:after="40" w:before="40"/>
-            </w:pPr>
-            <w:r/>
-            <w:r>
-              <w:rPr>
-                <w:rFonts w:ascii="Calibri" w:hAnsi="Calibri" w:eastAsia="Calibri"/>
-                <w:b w:val="0"/>
-                <w:i w:val="0"/>
-                <w:color w:val="1C1917"/>
-                <w:sz w:val="18"/>
-              </w:rPr>
-              <w:t>ya</w:t>
-            </w:r>
-          </w:p>
-        </w:tc>
-      </w:tr>
-      <w:tr>
-        <w:tc>
-          <w:tcPr>
-            <w:tcW w:type="dxa" w:w="2436"/>
-            <w:tcBorders>
-              <w:top w:val="single" w:sz="4" w:color="E8E0D5"/>
-              <w:left w:val="single" w:sz="4" w:color="E8E0D5"/>
-              <w:bottom w:val="single" w:sz="4" w:color="E8E0D5"/>
-              <w:right w:val="single" w:sz="4" w:color="E8E0D5"/>
-            </w:tcBorders>
-          </w:tcPr>
-          <w:p>
-            <w:pPr>
-              <w:spacing w:after="40" w:before="40"/>
-            </w:pPr>
-            <w:r/>
-            <w:r>
-              <w:rPr>
-                <w:rFonts w:ascii="Calibri" w:hAnsi="Calibri" w:eastAsia="Calibri"/>
-                <w:b w:val="0"/>
-                <w:i w:val="0"/>
-                <w:color w:val="1C1917"/>
-                <w:sz w:val="18"/>
-              </w:rPr>
-              <w:t>13</w:t>
-            </w:r>
-          </w:p>
-        </w:tc>
-        <w:tc>
-          <w:tcPr>
-            <w:tcW w:type="dxa" w:w="2436"/>
-            <w:tcBorders>
-              <w:top w:val="single" w:sz="4" w:color="E8E0D5"/>
-              <w:left w:val="single" w:sz="4" w:color="E8E0D5"/>
-              <w:bottom w:val="single" w:sz="4" w:color="E8E0D5"/>
-              <w:right w:val="single" w:sz="4" w:color="E8E0D5"/>
-            </w:tcBorders>
-          </w:tcPr>
-          <w:p>
-            <w:pPr>
-              <w:spacing w:after="40" w:before="40"/>
-            </w:pPr>
-            <w:r/>
-            <w:r>
-              <w:rPr>
-                <w:rFonts w:ascii="Calibri" w:hAnsi="Calibri" w:eastAsia="Calibri"/>
-                <w:b w:val="0"/>
-                <w:i w:val="0"/>
-                <w:color w:val="1C1917"/>
-                <w:sz w:val="18"/>
-              </w:rPr>
-              <w:t>Pull berarti memulai setiap kegiatan seawal mungkin sesuai jadwal induk.</w:t>
-            </w:r>
-          </w:p>
-        </w:tc>
-        <w:tc>
-          <w:tcPr>
-            <w:tcW w:type="dxa" w:w="2436"/>
-            <w:tcBorders>
-              <w:top w:val="single" w:sz="4" w:color="E8E0D5"/>
-              <w:left w:val="single" w:sz="4" w:color="E8E0D5"/>
-              <w:bottom w:val="single" w:sz="4" w:color="E8E0D5"/>
-              <w:right w:val="single" w:sz="4" w:color="E8E0D5"/>
-            </w:tcBorders>
-          </w:tcPr>
-          <w:p>
-            <w:pPr>
-              <w:spacing w:after="40" w:before="40"/>
-            </w:pPr>
-            <w:r/>
-            <w:r>
-              <w:rPr>
-                <w:rFonts w:ascii="Calibri" w:hAnsi="Calibri" w:eastAsia="Calibri"/>
-                <w:b w:val="0"/>
-                <w:i w:val="0"/>
-                <w:color w:val="1C1917"/>
-                <w:sz w:val="18"/>
-              </w:rPr>
-              <w:t>Likert 1–5</w:t>
-            </w:r>
-          </w:p>
-        </w:tc>
-        <w:tc>
-          <w:tcPr>
-            <w:tcW w:type="dxa" w:w="2436"/>
-            <w:tcBorders>
-              <w:top w:val="single" w:sz="4" w:color="E8E0D5"/>
-              <w:left w:val="single" w:sz="4" w:color="E8E0D5"/>
-              <w:bottom w:val="single" w:sz="4" w:color="E8E0D5"/>
-              <w:right w:val="single" w:sz="4" w:color="E8E0D5"/>
-            </w:tcBorders>
-          </w:tcPr>
-          <w:p>
-            <w:pPr>
-              <w:spacing w:after="40" w:before="40"/>
-            </w:pPr>
-            <w:r/>
-            <w:r>
-              <w:rPr>
-                <w:rFonts w:ascii="Calibri" w:hAnsi="Calibri" w:eastAsia="Calibri"/>
-                <w:b w:val="0"/>
-                <w:i w:val="0"/>
-                <w:color w:val="1C1917"/>
-                <w:sz w:val="18"/>
-              </w:rPr>
-              <w:t>ya</w:t>
-            </w:r>
-          </w:p>
-        </w:tc>
-      </w:tr>
-      <w:tr>
-        <w:tc>
-          <w:tcPr>
-            <w:tcW w:type="dxa" w:w="2436"/>
-            <w:tcBorders>
-              <w:top w:val="single" w:sz="4" w:color="E8E0D5"/>
-              <w:left w:val="single" w:sz="4" w:color="E8E0D5"/>
-              <w:bottom w:val="single" w:sz="4" w:color="E8E0D5"/>
-              <w:right w:val="single" w:sz="4" w:color="E8E0D5"/>
-            </w:tcBorders>
-            <w:shd w:fill="F7F3EE" w:val="clear"/>
-          </w:tcPr>
-          <w:p>
-            <w:pPr>
-              <w:spacing w:after="40" w:before="40"/>
-            </w:pPr>
-            <w:r/>
-            <w:r>
-              <w:rPr>
-                <w:rFonts w:ascii="Calibri" w:hAnsi="Calibri" w:eastAsia="Calibri"/>
-                <w:b w:val="0"/>
-                <w:i w:val="0"/>
-                <w:color w:val="1C1917"/>
-                <w:sz w:val="18"/>
-              </w:rPr>
-              <w:t>14</w:t>
+              <w:t>11</w:t>
             </w:r>
           </w:p>
         </w:tc>
@@ -2336,7 +2222,7 @@
           <w:color w:val="57534E"/>
           <w:sz w:val="20"/>
         </w:rPr>
-        <w:t>Kunci olah (jangan tampilkan di Form): butir 9, 10, 12, 13 terbalik (skor = 6 − x). Butir 11 dan 14 utuh. Indeks cara pandang LPS pra = rata-rata 9–14 setelah pembalikan.</w:t>
+        <w:t>Kunci olah (jangan tampilkan di Form): butir 8, 9, 10 terbalik (skor = 6 − x). Butir 11 utuh. Indeks cara pandang LPS pra = rata-rata 8–11 setelah pembalikan.</w:t>
       </w:r>
     </w:p>
     <w:p>
@@ -2352,7 +2238,7 @@
           <w:color w:val="9A4519"/>
           <w:sz w:val="28"/>
         </w:rPr>
-        <w:t>Form 2 — Pasca-simulasi</w:t>
+        <w:t>Form 2 — Pasca-simulasi (15 butir)</w:t>
       </w:r>
     </w:p>
     <w:p>
@@ -2392,7 +2278,7 @@
           <w:color w:val="1C1917"/>
           <w:sz w:val="22"/>
         </w:rPr>
-        <w:t>Isi setelah sesi simulator SiapKerja. Pakai kode R dan G yang sama seperti sebelum main. Jangan tulis nama orang atau nama instansi. Nilai SiapKerja sebagai alat latihan LPS. 1 = sangat tidak setuju, 5 = sangat setuju.</w:t>
+        <w:t>Isi setelah sesi simulator SiapKerja. Pakai kode sesi, R, dan G yang sama seperti sebelum main. Jangan tulis nama orang. Nilai SiapKerja sebagai alat latihan LPS. 1 = sangat tidak setuju, 5 = sangat setuju.</w:t>
       </w:r>
     </w:p>
     <w:tbl>
@@ -2573,7 +2459,7 @@
                 <w:color w:val="1C1917"/>
                 <w:sz w:val="18"/>
               </w:rPr>
-              <w:t>Kode responden (sama seperti sebelum main, contoh R07)</w:t>
+              <w:t>Kode sesi (sama seperti sebelum main, contoh S260901-A)</w:t>
             </w:r>
           </w:p>
         </w:tc>
@@ -2685,7 +2571,7 @@
                 <w:color w:val="1C1917"/>
                 <w:sz w:val="18"/>
               </w:rPr>
-              <w:t>Kode kelompok (sama seperti sebelum main, contoh G2)</w:t>
+              <w:t>Kode responden (sama seperti sebelum main, contoh R07)</w:t>
             </w:r>
           </w:p>
         </w:tc>
@@ -2770,6 +2656,7 @@
                 <w:color w:val="1C1917"/>
                 <w:sz w:val="18"/>
               </w:rPr>
+              <w:t>3</w:t>
             </w:r>
           </w:p>
         </w:tc>
@@ -2796,7 +2683,7 @@
                 <w:color w:val="1C1917"/>
                 <w:sz w:val="18"/>
               </w:rPr>
-              <w:t>Pekerjaan di SiapKerja</w:t>
+              <w:t>Kode kelompok / laptop (sama seperti sebelum main, contoh G2)</w:t>
             </w:r>
           </w:p>
         </w:tc>
@@ -2823,6 +2710,7 @@
                 <w:color w:val="1C1917"/>
                 <w:sz w:val="18"/>
               </w:rPr>
+              <w:t>isian singkat</w:t>
             </w:r>
           </w:p>
         </w:tc>
@@ -2849,6 +2737,7 @@
                 <w:color w:val="1C1917"/>
                 <w:sz w:val="18"/>
               </w:rPr>
+              <w:t>ya</w:t>
             </w:r>
           </w:p>
         </w:tc>
@@ -2878,7 +2767,6 @@
                 <w:color w:val="1C1917"/>
                 <w:sz w:val="18"/>
               </w:rPr>
-              <w:t>3</w:t>
             </w:r>
           </w:p>
         </w:tc>
@@ -2906,7 +2794,7 @@
                 <w:color w:val="1C1917"/>
                 <w:sz w:val="18"/>
               </w:rPr>
-              <w:t>Kegiatan di SiapKerja (galian, sloof, kolom, dinding) dekat dengan pekerjaan lapangan yang saya kenal.</w:t>
+              <w:t>Pekerjaan di SiapKerja</w:t>
             </w:r>
           </w:p>
         </w:tc>
@@ -2934,7 +2822,6 @@
                 <w:color w:val="1C1917"/>
                 <w:sz w:val="18"/>
               </w:rPr>
-              <w:t>Likert 1–5</w:t>
             </w:r>
           </w:p>
         </w:tc>
@@ -2962,7 +2849,6 @@
                 <w:color w:val="1C1917"/>
                 <w:sz w:val="18"/>
               </w:rPr>
-              <w:t>ya</w:t>
             </w:r>
           </w:p>
         </w:tc>
@@ -3018,7 +2904,7 @@
                 <w:color w:val="1C1917"/>
                 <w:sz w:val="18"/>
               </w:rPr>
-              <w:t>Denah dan zonasi rumah Type-36 membantu saya memahami urutan pekerjaan.</w:t>
+              <w:t>Kegiatan di SiapKerja (galian, sloof, kolom, dinding) dekat dengan pekerjaan lapangan yang saya kenal.</w:t>
             </w:r>
           </w:p>
         </w:tc>
@@ -3130,7 +3016,7 @@
                 <w:color w:val="1C1917"/>
                 <w:sz w:val="18"/>
               </w:rPr>
-              <w:t>Saya menjalankan urutan lengkap di SiapKerja: value pemilik, desain, pull, make-ready, janji mingguan, huddle, PPC.</w:t>
+              <w:t>Saya merasakan beda merencana dari Gantt (push) dan merencana dari pekerjaan yang sudah siap (pull).</w:t>
             </w:r>
           </w:p>
         </w:tc>
@@ -3215,7 +3101,6 @@
                 <w:color w:val="1C1917"/>
                 <w:sz w:val="18"/>
               </w:rPr>
-              <w:t>6</w:t>
             </w:r>
           </w:p>
         </w:tc>
@@ -3242,7 +3127,7 @@
                 <w:color w:val="1C1917"/>
                 <w:sz w:val="18"/>
               </w:rPr>
-              <w:t>Saya merasakan beda merencana dari Gantt (push) dan merencana dari pekerjaan yang sudah siap (pull).</w:t>
+              <w:t>Menjalankan LPS lewat SiapKerja</w:t>
             </w:r>
           </w:p>
         </w:tc>
@@ -3269,7 +3154,6 @@
                 <w:color w:val="1C1917"/>
                 <w:sz w:val="18"/>
               </w:rPr>
-              <w:t>Likert 1–5</w:t>
             </w:r>
           </w:p>
         </w:tc>
@@ -3296,7 +3180,6 @@
                 <w:color w:val="1C1917"/>
                 <w:sz w:val="18"/>
               </w:rPr>
-              <w:t>ya</w:t>
             </w:r>
           </w:p>
         </w:tc>
@@ -3326,228 +3209,7 @@
                 <w:color w:val="1C1917"/>
                 <w:sz w:val="18"/>
               </w:rPr>
-            </w:r>
-          </w:p>
-        </w:tc>
-        <w:tc>
-          <w:tcPr>
-            <w:tcW w:type="dxa" w:w="2436"/>
-            <w:tcBorders>
-              <w:top w:val="single" w:sz="4" w:color="E8E0D5"/>
-              <w:left w:val="single" w:sz="4" w:color="E8E0D5"/>
-              <w:bottom w:val="single" w:sz="4" w:color="E8E0D5"/>
-              <w:right w:val="single" w:sz="4" w:color="E8E0D5"/>
-            </w:tcBorders>
-            <w:shd w:fill="F7F3EE" w:val="clear"/>
-          </w:tcPr>
-          <w:p>
-            <w:pPr>
-              <w:spacing w:after="40" w:before="40"/>
-            </w:pPr>
-            <w:r/>
-            <w:r>
-              <w:rPr>
-                <w:rFonts w:ascii="Calibri" w:hAnsi="Calibri" w:eastAsia="Calibri"/>
-                <w:b w:val="0"/>
-                <w:i w:val="0"/>
-                <w:color w:val="1C1917"/>
-                <w:sz w:val="18"/>
-              </w:rPr>
-              <w:t>Menjalankan LPS lewat SiapKerja</w:t>
-            </w:r>
-          </w:p>
-        </w:tc>
-        <w:tc>
-          <w:tcPr>
-            <w:tcW w:type="dxa" w:w="2436"/>
-            <w:tcBorders>
-              <w:top w:val="single" w:sz="4" w:color="E8E0D5"/>
-              <w:left w:val="single" w:sz="4" w:color="E8E0D5"/>
-              <w:bottom w:val="single" w:sz="4" w:color="E8E0D5"/>
-              <w:right w:val="single" w:sz="4" w:color="E8E0D5"/>
-            </w:tcBorders>
-            <w:shd w:fill="F7F3EE" w:val="clear"/>
-          </w:tcPr>
-          <w:p>
-            <w:pPr>
-              <w:spacing w:after="40" w:before="40"/>
-            </w:pPr>
-            <w:r/>
-            <w:r>
-              <w:rPr>
-                <w:rFonts w:ascii="Calibri" w:hAnsi="Calibri" w:eastAsia="Calibri"/>
-                <w:b w:val="0"/>
-                <w:i w:val="0"/>
-                <w:color w:val="1C1917"/>
-                <w:sz w:val="18"/>
-              </w:rPr>
-            </w:r>
-          </w:p>
-        </w:tc>
-        <w:tc>
-          <w:tcPr>
-            <w:tcW w:type="dxa" w:w="2436"/>
-            <w:tcBorders>
-              <w:top w:val="single" w:sz="4" w:color="E8E0D5"/>
-              <w:left w:val="single" w:sz="4" w:color="E8E0D5"/>
-              <w:bottom w:val="single" w:sz="4" w:color="E8E0D5"/>
-              <w:right w:val="single" w:sz="4" w:color="E8E0D5"/>
-            </w:tcBorders>
-            <w:shd w:fill="F7F3EE" w:val="clear"/>
-          </w:tcPr>
-          <w:p>
-            <w:pPr>
-              <w:spacing w:after="40" w:before="40"/>
-            </w:pPr>
-            <w:r/>
-            <w:r>
-              <w:rPr>
-                <w:rFonts w:ascii="Calibri" w:hAnsi="Calibri" w:eastAsia="Calibri"/>
-                <w:b w:val="0"/>
-                <w:i w:val="0"/>
-                <w:color w:val="1C1917"/>
-                <w:sz w:val="18"/>
-              </w:rPr>
-            </w:r>
-          </w:p>
-        </w:tc>
-      </w:tr>
-      <w:tr>
-        <w:tc>
-          <w:tcPr>
-            <w:tcW w:type="dxa" w:w="2436"/>
-            <w:tcBorders>
-              <w:top w:val="single" w:sz="4" w:color="E8E0D5"/>
-              <w:left w:val="single" w:sz="4" w:color="E8E0D5"/>
-              <w:bottom w:val="single" w:sz="4" w:color="E8E0D5"/>
-              <w:right w:val="single" w:sz="4" w:color="E8E0D5"/>
-            </w:tcBorders>
-          </w:tcPr>
-          <w:p>
-            <w:pPr>
-              <w:spacing w:after="40" w:before="40"/>
-            </w:pPr>
-            <w:r/>
-            <w:r>
-              <w:rPr>
-                <w:rFonts w:ascii="Calibri" w:hAnsi="Calibri" w:eastAsia="Calibri"/>
-                <w:b w:val="0"/>
-                <w:i w:val="0"/>
-                <w:color w:val="1C1917"/>
-                <w:sz w:val="18"/>
-              </w:rPr>
-              <w:t>7</w:t>
-            </w:r>
-          </w:p>
-        </w:tc>
-        <w:tc>
-          <w:tcPr>
-            <w:tcW w:type="dxa" w:w="2436"/>
-            <w:tcBorders>
-              <w:top w:val="single" w:sz="4" w:color="E8E0D5"/>
-              <w:left w:val="single" w:sz="4" w:color="E8E0D5"/>
-              <w:bottom w:val="single" w:sz="4" w:color="E8E0D5"/>
-              <w:right w:val="single" w:sz="4" w:color="E8E0D5"/>
-            </w:tcBorders>
-          </w:tcPr>
-          <w:p>
-            <w:pPr>
-              <w:spacing w:after="40" w:before="40"/>
-            </w:pPr>
-            <w:r/>
-            <w:r>
-              <w:rPr>
-                <w:rFonts w:ascii="Calibri" w:hAnsi="Calibri" w:eastAsia="Calibri"/>
-                <w:b w:val="0"/>
-                <w:i w:val="0"/>
-                <w:color w:val="1C1917"/>
-                <w:sz w:val="18"/>
-              </w:rPr>
-              <w:t>Setelah main SiapKerja, last planner merencana dari pekerjaan, bukan dari batang Gantt.</w:t>
-            </w:r>
-          </w:p>
-        </w:tc>
-        <w:tc>
-          <w:tcPr>
-            <w:tcW w:type="dxa" w:w="2436"/>
-            <w:tcBorders>
-              <w:top w:val="single" w:sz="4" w:color="E8E0D5"/>
-              <w:left w:val="single" w:sz="4" w:color="E8E0D5"/>
-              <w:bottom w:val="single" w:sz="4" w:color="E8E0D5"/>
-              <w:right w:val="single" w:sz="4" w:color="E8E0D5"/>
-            </w:tcBorders>
-          </w:tcPr>
-          <w:p>
-            <w:pPr>
-              <w:spacing w:after="40" w:before="40"/>
-            </w:pPr>
-            <w:r/>
-            <w:r>
-              <w:rPr>
-                <w:rFonts w:ascii="Calibri" w:hAnsi="Calibri" w:eastAsia="Calibri"/>
-                <w:b w:val="0"/>
-                <w:i w:val="0"/>
-                <w:color w:val="1C1917"/>
-                <w:sz w:val="18"/>
-              </w:rPr>
-              <w:t>Likert 1–5</w:t>
-            </w:r>
-          </w:p>
-        </w:tc>
-        <w:tc>
-          <w:tcPr>
-            <w:tcW w:type="dxa" w:w="2436"/>
-            <w:tcBorders>
-              <w:top w:val="single" w:sz="4" w:color="E8E0D5"/>
-              <w:left w:val="single" w:sz="4" w:color="E8E0D5"/>
-              <w:bottom w:val="single" w:sz="4" w:color="E8E0D5"/>
-              <w:right w:val="single" w:sz="4" w:color="E8E0D5"/>
-            </w:tcBorders>
-          </w:tcPr>
-          <w:p>
-            <w:pPr>
-              <w:spacing w:after="40" w:before="40"/>
-            </w:pPr>
-            <w:r/>
-            <w:r>
-              <w:rPr>
-                <w:rFonts w:ascii="Calibri" w:hAnsi="Calibri" w:eastAsia="Calibri"/>
-                <w:b w:val="0"/>
-                <w:i w:val="0"/>
-                <w:color w:val="1C1917"/>
-                <w:sz w:val="18"/>
-              </w:rPr>
-              <w:t>ya</w:t>
-            </w:r>
-          </w:p>
-        </w:tc>
-      </w:tr>
-      <w:tr>
-        <w:tc>
-          <w:tcPr>
-            <w:tcW w:type="dxa" w:w="2436"/>
-            <w:tcBorders>
-              <w:top w:val="single" w:sz="4" w:color="E8E0D5"/>
-              <w:left w:val="single" w:sz="4" w:color="E8E0D5"/>
-              <w:bottom w:val="single" w:sz="4" w:color="E8E0D5"/>
-              <w:right w:val="single" w:sz="4" w:color="E8E0D5"/>
-            </w:tcBorders>
-            <w:shd w:fill="F7F3EE" w:val="clear"/>
-          </w:tcPr>
-          <w:p>
-            <w:pPr>
-              <w:spacing w:after="40" w:before="40"/>
-            </w:pPr>
-            <w:r/>
-            <w:r>
-              <w:rPr>
-                <w:rFonts w:ascii="Calibri" w:hAnsi="Calibri" w:eastAsia="Calibri"/>
-                <w:b w:val="0"/>
-                <w:i w:val="0"/>
-                <w:color w:val="1C1917"/>
-                <w:sz w:val="18"/>
-              </w:rPr>
-              <w:t>8</w:t>
+              <w:t>6</w:t>
             </w:r>
           </w:p>
         </w:tc>
@@ -3660,7 +3322,7 @@
                 <w:color w:val="1C1917"/>
                 <w:sz w:val="18"/>
               </w:rPr>
-              <w:t>9</w:t>
+              <w:t>7</w:t>
             </w:r>
           </w:p>
         </w:tc>
@@ -3687,231 +3349,7 @@
                 <w:color w:val="1C1917"/>
                 <w:sz w:val="18"/>
               </w:rPr>
-              <w:t>PPC di SiapKerja mengukur keandalan janji mingguan.</w:t>
-            </w:r>
-          </w:p>
-        </w:tc>
-        <w:tc>
-          <w:tcPr>
-            <w:tcW w:type="dxa" w:w="2436"/>
-            <w:tcBorders>
-              <w:top w:val="single" w:sz="4" w:color="E8E0D5"/>
-              <w:left w:val="single" w:sz="4" w:color="E8E0D5"/>
-              <w:bottom w:val="single" w:sz="4" w:color="E8E0D5"/>
-              <w:right w:val="single" w:sz="4" w:color="E8E0D5"/>
-            </w:tcBorders>
-          </w:tcPr>
-          <w:p>
-            <w:pPr>
-              <w:spacing w:after="40" w:before="40"/>
-            </w:pPr>
-            <w:r/>
-            <w:r>
-              <w:rPr>
-                <w:rFonts w:ascii="Calibri" w:hAnsi="Calibri" w:eastAsia="Calibri"/>
-                <w:b w:val="0"/>
-                <w:i w:val="0"/>
-                <w:color w:val="1C1917"/>
-                <w:sz w:val="18"/>
-              </w:rPr>
-              <w:t>Likert 1–5</w:t>
-            </w:r>
-          </w:p>
-        </w:tc>
-        <w:tc>
-          <w:tcPr>
-            <w:tcW w:type="dxa" w:w="2436"/>
-            <w:tcBorders>
-              <w:top w:val="single" w:sz="4" w:color="E8E0D5"/>
-              <w:left w:val="single" w:sz="4" w:color="E8E0D5"/>
-              <w:bottom w:val="single" w:sz="4" w:color="E8E0D5"/>
-              <w:right w:val="single" w:sz="4" w:color="E8E0D5"/>
-            </w:tcBorders>
-          </w:tcPr>
-          <w:p>
-            <w:pPr>
-              <w:spacing w:after="40" w:before="40"/>
-            </w:pPr>
-            <w:r/>
-            <w:r>
-              <w:rPr>
-                <w:rFonts w:ascii="Calibri" w:hAnsi="Calibri" w:eastAsia="Calibri"/>
-                <w:b w:val="0"/>
-                <w:i w:val="0"/>
-                <w:color w:val="1C1917"/>
-                <w:sz w:val="18"/>
-              </w:rPr>
-              <w:t>ya</w:t>
-            </w:r>
-          </w:p>
-        </w:tc>
-      </w:tr>
-      <w:tr>
-        <w:tc>
-          <w:tcPr>
-            <w:tcW w:type="dxa" w:w="2436"/>
-            <w:tcBorders>
-              <w:top w:val="single" w:sz="4" w:color="E8E0D5"/>
-              <w:left w:val="single" w:sz="4" w:color="E8E0D5"/>
-              <w:bottom w:val="single" w:sz="4" w:color="E8E0D5"/>
-              <w:right w:val="single" w:sz="4" w:color="E8E0D5"/>
-            </w:tcBorders>
-            <w:shd w:fill="F7F3EE" w:val="clear"/>
-          </w:tcPr>
-          <w:p>
-            <w:pPr>
-              <w:spacing w:after="40" w:before="40"/>
-            </w:pPr>
-            <w:r/>
-            <w:r>
-              <w:rPr>
-                <w:rFonts w:ascii="Calibri" w:hAnsi="Calibri" w:eastAsia="Calibri"/>
-                <w:b w:val="0"/>
-                <w:i w:val="0"/>
-                <w:color w:val="1C1917"/>
-                <w:sz w:val="18"/>
-              </w:rPr>
-              <w:t>10</w:t>
-            </w:r>
-          </w:p>
-        </w:tc>
-        <w:tc>
-          <w:tcPr>
-            <w:tcW w:type="dxa" w:w="2436"/>
-            <w:tcBorders>
-              <w:top w:val="single" w:sz="4" w:color="E8E0D5"/>
-              <w:left w:val="single" w:sz="4" w:color="E8E0D5"/>
-              <w:bottom w:val="single" w:sz="4" w:color="E8E0D5"/>
-              <w:right w:val="single" w:sz="4" w:color="E8E0D5"/>
-            </w:tcBorders>
-            <w:shd w:fill="F7F3EE" w:val="clear"/>
-          </w:tcPr>
-          <w:p>
-            <w:pPr>
-              <w:spacing w:after="40" w:before="40"/>
-            </w:pPr>
-            <w:r/>
-            <w:r>
-              <w:rPr>
-                <w:rFonts w:ascii="Calibri" w:hAnsi="Calibri" w:eastAsia="Calibri"/>
-                <w:b w:val="0"/>
-                <w:i w:val="0"/>
-                <w:color w:val="1C1917"/>
-                <w:sz w:val="18"/>
-              </w:rPr>
               <w:t>Make-ready terasa sebagai kerja menyiapkan constraint, bukan hanya istilah.</w:t>
-            </w:r>
-          </w:p>
-        </w:tc>
-        <w:tc>
-          <w:tcPr>
-            <w:tcW w:type="dxa" w:w="2436"/>
-            <w:tcBorders>
-              <w:top w:val="single" w:sz="4" w:color="E8E0D5"/>
-              <w:left w:val="single" w:sz="4" w:color="E8E0D5"/>
-              <w:bottom w:val="single" w:sz="4" w:color="E8E0D5"/>
-              <w:right w:val="single" w:sz="4" w:color="E8E0D5"/>
-            </w:tcBorders>
-            <w:shd w:fill="F7F3EE" w:val="clear"/>
-          </w:tcPr>
-          <w:p>
-            <w:pPr>
-              <w:spacing w:after="40" w:before="40"/>
-            </w:pPr>
-            <w:r/>
-            <w:r>
-              <w:rPr>
-                <w:rFonts w:ascii="Calibri" w:hAnsi="Calibri" w:eastAsia="Calibri"/>
-                <w:b w:val="0"/>
-                <w:i w:val="0"/>
-                <w:color w:val="1C1917"/>
-                <w:sz w:val="18"/>
-              </w:rPr>
-              <w:t>Likert 1–5</w:t>
-            </w:r>
-          </w:p>
-        </w:tc>
-        <w:tc>
-          <w:tcPr>
-            <w:tcW w:type="dxa" w:w="2436"/>
-            <w:tcBorders>
-              <w:top w:val="single" w:sz="4" w:color="E8E0D5"/>
-              <w:left w:val="single" w:sz="4" w:color="E8E0D5"/>
-              <w:bottom w:val="single" w:sz="4" w:color="E8E0D5"/>
-              <w:right w:val="single" w:sz="4" w:color="E8E0D5"/>
-            </w:tcBorders>
-            <w:shd w:fill="F7F3EE" w:val="clear"/>
-          </w:tcPr>
-          <w:p>
-            <w:pPr>
-              <w:spacing w:after="40" w:before="40"/>
-            </w:pPr>
-            <w:r/>
-            <w:r>
-              <w:rPr>
-                <w:rFonts w:ascii="Calibri" w:hAnsi="Calibri" w:eastAsia="Calibri"/>
-                <w:b w:val="0"/>
-                <w:i w:val="0"/>
-                <w:color w:val="1C1917"/>
-                <w:sz w:val="18"/>
-              </w:rPr>
-              <w:t>ya</w:t>
-            </w:r>
-          </w:p>
-        </w:tc>
-      </w:tr>
-      <w:tr>
-        <w:tc>
-          <w:tcPr>
-            <w:tcW w:type="dxa" w:w="2436"/>
-            <w:tcBorders>
-              <w:top w:val="single" w:sz="4" w:color="E8E0D5"/>
-              <w:left w:val="single" w:sz="4" w:color="E8E0D5"/>
-              <w:bottom w:val="single" w:sz="4" w:color="E8E0D5"/>
-              <w:right w:val="single" w:sz="4" w:color="E8E0D5"/>
-            </w:tcBorders>
-          </w:tcPr>
-          <w:p>
-            <w:pPr>
-              <w:spacing w:after="40" w:before="40"/>
-            </w:pPr>
-            <w:r/>
-            <w:r>
-              <w:rPr>
-                <w:rFonts w:ascii="Calibri" w:hAnsi="Calibri" w:eastAsia="Calibri"/>
-                <w:b w:val="0"/>
-                <w:i w:val="0"/>
-                <w:color w:val="1C1917"/>
-                <w:sz w:val="18"/>
-              </w:rPr>
-              <w:t>11</w:t>
-            </w:r>
-          </w:p>
-        </w:tc>
-        <w:tc>
-          <w:tcPr>
-            <w:tcW w:type="dxa" w:w="2436"/>
-            <w:tcBorders>
-              <w:top w:val="single" w:sz="4" w:color="E8E0D5"/>
-              <w:left w:val="single" w:sz="4" w:color="E8E0D5"/>
-              <w:bottom w:val="single" w:sz="4" w:color="E8E0D5"/>
-              <w:right w:val="single" w:sz="4" w:color="E8E0D5"/>
-            </w:tcBorders>
-          </w:tcPr>
-          <w:p>
-            <w:pPr>
-              <w:spacing w:after="40" w:before="40"/>
-            </w:pPr>
-            <w:r/>
-            <w:r>
-              <w:rPr>
-                <w:rFonts w:ascii="Calibri" w:hAnsi="Calibri" w:eastAsia="Calibri"/>
-                <w:b w:val="0"/>
-                <w:i w:val="0"/>
-                <w:color w:val="1C1917"/>
-                <w:sz w:val="18"/>
-              </w:rPr>
-              <w:t>Daily huddle terasa sebagai rapat lapangan singkat.</w:t>
             </w:r>
           </w:p>
         </w:tc>
@@ -4022,7 +3460,7 @@
                 <w:color w:val="1C1917"/>
                 <w:sz w:val="18"/>
               </w:rPr>
-              <w:t>Ulangi 6 butir LPS (selisih pra–pasca)</w:t>
+              <w:t>Ulangi 4 butir LPS (wajib tetap, selisih pra–pasca)</w:t>
             </w:r>
           </w:p>
         </w:tc>
@@ -4105,7 +3543,7 @@
                 <w:color w:val="1C1917"/>
                 <w:sz w:val="18"/>
               </w:rPr>
-              <w:t>12</w:t>
+              <w:t>8</w:t>
             </w:r>
           </w:p>
         </w:tc>
@@ -4132,7 +3570,7 @@
                 <w:color w:val="1C1917"/>
                 <w:sz w:val="18"/>
               </w:rPr>
-              <w:t>Jadwal induk (Gantt/CPM) sudah cukup untuk mengendalikan produksi mingguan.</w:t>
+              <w:t>Pekerjaan minggu depan boleh dijanjikan meskipun masih ada kendala yang belum dilepas.</w:t>
             </w:r>
           </w:p>
         </w:tc>
@@ -4216,7 +3654,7 @@
                 <w:color w:val="1C1917"/>
                 <w:sz w:val="18"/>
               </w:rPr>
-              <w:t>13</w:t>
+              <w:t>9</w:t>
             </w:r>
           </w:p>
         </w:tc>
@@ -4244,7 +3682,7 @@
                 <w:color w:val="1C1917"/>
                 <w:sz w:val="18"/>
               </w:rPr>
-              <w:t>Pekerjaan minggu depan boleh dijanjikan meskipun masih ada kendala yang belum dilepas.</w:t>
+              <w:t>Pull berarti memulai setiap kegiatan seawal mungkin sesuai jadwal induk.</w:t>
             </w:r>
           </w:p>
         </w:tc>
@@ -4329,7 +3767,7 @@
                 <w:color w:val="1C1917"/>
                 <w:sz w:val="18"/>
               </w:rPr>
-              <w:t>14</w:t>
+              <w:t>10</w:t>
             </w:r>
           </w:p>
         </w:tc>
@@ -4356,7 +3794,7 @@
                 <w:color w:val="1C1917"/>
                 <w:sz w:val="18"/>
               </w:rPr>
-              <w:t>Last planner adalah orang yang paling dekat dengan pekerjaan, bukan hanya planner di kantor lapangan.</w:t>
+              <w:t>PPC mengukur seberapa cepat bangunan diselesaikan.</w:t>
             </w:r>
           </w:p>
         </w:tc>
@@ -4440,231 +3878,7 @@
                 <w:color w:val="1C1917"/>
                 <w:sz w:val="18"/>
               </w:rPr>
-              <w:t>15</w:t>
-            </w:r>
-          </w:p>
-        </w:tc>
-        <w:tc>
-          <w:tcPr>
-            <w:tcW w:type="dxa" w:w="2436"/>
-            <w:tcBorders>
-              <w:top w:val="single" w:sz="4" w:color="E8E0D5"/>
-              <w:left w:val="single" w:sz="4" w:color="E8E0D5"/>
-              <w:bottom w:val="single" w:sz="4" w:color="E8E0D5"/>
-              <w:right w:val="single" w:sz="4" w:color="E8E0D5"/>
-            </w:tcBorders>
-            <w:shd w:fill="F7F3EE" w:val="clear"/>
-          </w:tcPr>
-          <w:p>
-            <w:pPr>
-              <w:spacing w:after="40" w:before="40"/>
-            </w:pPr>
-            <w:r/>
-            <w:r>
-              <w:rPr>
-                <w:rFonts w:ascii="Calibri" w:hAnsi="Calibri" w:eastAsia="Calibri"/>
-                <w:b w:val="0"/>
-                <w:i w:val="0"/>
-                <w:color w:val="1C1917"/>
-                <w:sz w:val="18"/>
-              </w:rPr>
-              <w:t>PPC mengukur seberapa cepat bangunan diselesaikan.</w:t>
-            </w:r>
-          </w:p>
-        </w:tc>
-        <w:tc>
-          <w:tcPr>
-            <w:tcW w:type="dxa" w:w="2436"/>
-            <w:tcBorders>
-              <w:top w:val="single" w:sz="4" w:color="E8E0D5"/>
-              <w:left w:val="single" w:sz="4" w:color="E8E0D5"/>
-              <w:bottom w:val="single" w:sz="4" w:color="E8E0D5"/>
-              <w:right w:val="single" w:sz="4" w:color="E8E0D5"/>
-            </w:tcBorders>
-            <w:shd w:fill="F7F3EE" w:val="clear"/>
-          </w:tcPr>
-          <w:p>
-            <w:pPr>
-              <w:spacing w:after="40" w:before="40"/>
-            </w:pPr>
-            <w:r/>
-            <w:r>
-              <w:rPr>
-                <w:rFonts w:ascii="Calibri" w:hAnsi="Calibri" w:eastAsia="Calibri"/>
-                <w:b w:val="0"/>
-                <w:i w:val="0"/>
-                <w:color w:val="1C1917"/>
-                <w:sz w:val="18"/>
-              </w:rPr>
-              <w:t>Likert 1–5</w:t>
-            </w:r>
-          </w:p>
-        </w:tc>
-        <w:tc>
-          <w:tcPr>
-            <w:tcW w:type="dxa" w:w="2436"/>
-            <w:tcBorders>
-              <w:top w:val="single" w:sz="4" w:color="E8E0D5"/>
-              <w:left w:val="single" w:sz="4" w:color="E8E0D5"/>
-              <w:bottom w:val="single" w:sz="4" w:color="E8E0D5"/>
-              <w:right w:val="single" w:sz="4" w:color="E8E0D5"/>
-            </w:tcBorders>
-            <w:shd w:fill="F7F3EE" w:val="clear"/>
-          </w:tcPr>
-          <w:p>
-            <w:pPr>
-              <w:spacing w:after="40" w:before="40"/>
-            </w:pPr>
-            <w:r/>
-            <w:r>
-              <w:rPr>
-                <w:rFonts w:ascii="Calibri" w:hAnsi="Calibri" w:eastAsia="Calibri"/>
-                <w:b w:val="0"/>
-                <w:i w:val="0"/>
-                <w:color w:val="1C1917"/>
-                <w:sz w:val="18"/>
-              </w:rPr>
-              <w:t>ya</w:t>
-            </w:r>
-          </w:p>
-        </w:tc>
-      </w:tr>
-      <w:tr>
-        <w:tc>
-          <w:tcPr>
-            <w:tcW w:type="dxa" w:w="2436"/>
-            <w:tcBorders>
-              <w:top w:val="single" w:sz="4" w:color="E8E0D5"/>
-              <w:left w:val="single" w:sz="4" w:color="E8E0D5"/>
-              <w:bottom w:val="single" w:sz="4" w:color="E8E0D5"/>
-              <w:right w:val="single" w:sz="4" w:color="E8E0D5"/>
-            </w:tcBorders>
-          </w:tcPr>
-          <w:p>
-            <w:pPr>
-              <w:spacing w:after="40" w:before="40"/>
-            </w:pPr>
-            <w:r/>
-            <w:r>
-              <w:rPr>
-                <w:rFonts w:ascii="Calibri" w:hAnsi="Calibri" w:eastAsia="Calibri"/>
-                <w:b w:val="0"/>
-                <w:i w:val="0"/>
-                <w:color w:val="1C1917"/>
-                <w:sz w:val="18"/>
-              </w:rPr>
-              <w:t>16</w:t>
-            </w:r>
-          </w:p>
-        </w:tc>
-        <w:tc>
-          <w:tcPr>
-            <w:tcW w:type="dxa" w:w="2436"/>
-            <w:tcBorders>
-              <w:top w:val="single" w:sz="4" w:color="E8E0D5"/>
-              <w:left w:val="single" w:sz="4" w:color="E8E0D5"/>
-              <w:bottom w:val="single" w:sz="4" w:color="E8E0D5"/>
-              <w:right w:val="single" w:sz="4" w:color="E8E0D5"/>
-            </w:tcBorders>
-          </w:tcPr>
-          <w:p>
-            <w:pPr>
-              <w:spacing w:after="40" w:before="40"/>
-            </w:pPr>
-            <w:r/>
-            <w:r>
-              <w:rPr>
-                <w:rFonts w:ascii="Calibri" w:hAnsi="Calibri" w:eastAsia="Calibri"/>
-                <w:b w:val="0"/>
-                <w:i w:val="0"/>
-                <w:color w:val="1C1917"/>
-                <w:sz w:val="18"/>
-              </w:rPr>
-              <w:t>Pull berarti memulai setiap kegiatan seawal mungkin sesuai jadwal induk.</w:t>
-            </w:r>
-          </w:p>
-        </w:tc>
-        <w:tc>
-          <w:tcPr>
-            <w:tcW w:type="dxa" w:w="2436"/>
-            <w:tcBorders>
-              <w:top w:val="single" w:sz="4" w:color="E8E0D5"/>
-              <w:left w:val="single" w:sz="4" w:color="E8E0D5"/>
-              <w:bottom w:val="single" w:sz="4" w:color="E8E0D5"/>
-              <w:right w:val="single" w:sz="4" w:color="E8E0D5"/>
-            </w:tcBorders>
-          </w:tcPr>
-          <w:p>
-            <w:pPr>
-              <w:spacing w:after="40" w:before="40"/>
-            </w:pPr>
-            <w:r/>
-            <w:r>
-              <w:rPr>
-                <w:rFonts w:ascii="Calibri" w:hAnsi="Calibri" w:eastAsia="Calibri"/>
-                <w:b w:val="0"/>
-                <w:i w:val="0"/>
-                <w:color w:val="1C1917"/>
-                <w:sz w:val="18"/>
-              </w:rPr>
-              <w:t>Likert 1–5</w:t>
-            </w:r>
-          </w:p>
-        </w:tc>
-        <w:tc>
-          <w:tcPr>
-            <w:tcW w:type="dxa" w:w="2436"/>
-            <w:tcBorders>
-              <w:top w:val="single" w:sz="4" w:color="E8E0D5"/>
-              <w:left w:val="single" w:sz="4" w:color="E8E0D5"/>
-              <w:bottom w:val="single" w:sz="4" w:color="E8E0D5"/>
-              <w:right w:val="single" w:sz="4" w:color="E8E0D5"/>
-            </w:tcBorders>
-          </w:tcPr>
-          <w:p>
-            <w:pPr>
-              <w:spacing w:after="40" w:before="40"/>
-            </w:pPr>
-            <w:r/>
-            <w:r>
-              <w:rPr>
-                <w:rFonts w:ascii="Calibri" w:hAnsi="Calibri" w:eastAsia="Calibri"/>
-                <w:b w:val="0"/>
-                <w:i w:val="0"/>
-                <w:color w:val="1C1917"/>
-                <w:sz w:val="18"/>
-              </w:rPr>
-              <w:t>ya</w:t>
-            </w:r>
-          </w:p>
-        </w:tc>
-      </w:tr>
-      <w:tr>
-        <w:tc>
-          <w:tcPr>
-            <w:tcW w:type="dxa" w:w="2436"/>
-            <w:tcBorders>
-              <w:top w:val="single" w:sz="4" w:color="E8E0D5"/>
-              <w:left w:val="single" w:sz="4" w:color="E8E0D5"/>
-              <w:bottom w:val="single" w:sz="4" w:color="E8E0D5"/>
-              <w:right w:val="single" w:sz="4" w:color="E8E0D5"/>
-            </w:tcBorders>
-            <w:shd w:fill="F7F3EE" w:val="clear"/>
-          </w:tcPr>
-          <w:p>
-            <w:pPr>
-              <w:spacing w:after="40" w:before="40"/>
-            </w:pPr>
-            <w:r/>
-            <w:r>
-              <w:rPr>
-                <w:rFonts w:ascii="Calibri" w:hAnsi="Calibri" w:eastAsia="Calibri"/>
-                <w:b w:val="0"/>
-                <w:i w:val="0"/>
-                <w:color w:val="1C1917"/>
-                <w:sz w:val="18"/>
-              </w:rPr>
-              <w:t>17</w:t>
+              <w:t>11</w:t>
             </w:r>
           </w:p>
         </w:tc>
@@ -4885,455 +4099,7 @@
                 <w:color w:val="1C1917"/>
                 <w:sz w:val="18"/>
               </w:rPr>
-              <w:t>18</w:t>
-            </w:r>
-          </w:p>
-        </w:tc>
-        <w:tc>
-          <w:tcPr>
-            <w:tcW w:type="dxa" w:w="2436"/>
-            <w:tcBorders>
-              <w:top w:val="single" w:sz="4" w:color="E8E0D5"/>
-              <w:left w:val="single" w:sz="4" w:color="E8E0D5"/>
-              <w:bottom w:val="single" w:sz="4" w:color="E8E0D5"/>
-              <w:right w:val="single" w:sz="4" w:color="E8E0D5"/>
-            </w:tcBorders>
-            <w:shd w:fill="F7F3EE" w:val="clear"/>
-          </w:tcPr>
-          <w:p>
-            <w:pPr>
-              <w:spacing w:after="40" w:before="40"/>
-            </w:pPr>
-            <w:r/>
-            <w:r>
-              <w:rPr>
-                <w:rFonts w:ascii="Calibri" w:hAnsi="Calibri" w:eastAsia="Calibri"/>
-                <w:b w:val="0"/>
-                <w:i w:val="0"/>
-                <w:color w:val="1C1917"/>
-                <w:sz w:val="18"/>
-              </w:rPr>
-              <w:t>Saya bisa menjalankan SiapKerja di laptop tanpa server khusus.</w:t>
-            </w:r>
-          </w:p>
-        </w:tc>
-        <w:tc>
-          <w:tcPr>
-            <w:tcW w:type="dxa" w:w="2436"/>
-            <w:tcBorders>
-              <w:top w:val="single" w:sz="4" w:color="E8E0D5"/>
-              <w:left w:val="single" w:sz="4" w:color="E8E0D5"/>
-              <w:bottom w:val="single" w:sz="4" w:color="E8E0D5"/>
-              <w:right w:val="single" w:sz="4" w:color="E8E0D5"/>
-            </w:tcBorders>
-            <w:shd w:fill="F7F3EE" w:val="clear"/>
-          </w:tcPr>
-          <w:p>
-            <w:pPr>
-              <w:spacing w:after="40" w:before="40"/>
-            </w:pPr>
-            <w:r/>
-            <w:r>
-              <w:rPr>
-                <w:rFonts w:ascii="Calibri" w:hAnsi="Calibri" w:eastAsia="Calibri"/>
-                <w:b w:val="0"/>
-                <w:i w:val="0"/>
-                <w:color w:val="1C1917"/>
-                <w:sz w:val="18"/>
-              </w:rPr>
-              <w:t>Likert 1–5</w:t>
-            </w:r>
-          </w:p>
-        </w:tc>
-        <w:tc>
-          <w:tcPr>
-            <w:tcW w:type="dxa" w:w="2436"/>
-            <w:tcBorders>
-              <w:top w:val="single" w:sz="4" w:color="E8E0D5"/>
-              <w:left w:val="single" w:sz="4" w:color="E8E0D5"/>
-              <w:bottom w:val="single" w:sz="4" w:color="E8E0D5"/>
-              <w:right w:val="single" w:sz="4" w:color="E8E0D5"/>
-            </w:tcBorders>
-            <w:shd w:fill="F7F3EE" w:val="clear"/>
-          </w:tcPr>
-          <w:p>
-            <w:pPr>
-              <w:spacing w:after="40" w:before="40"/>
-            </w:pPr>
-            <w:r/>
-            <w:r>
-              <w:rPr>
-                <w:rFonts w:ascii="Calibri" w:hAnsi="Calibri" w:eastAsia="Calibri"/>
-                <w:b w:val="0"/>
-                <w:i w:val="0"/>
-                <w:color w:val="1C1917"/>
-                <w:sz w:val="18"/>
-              </w:rPr>
-              <w:t>ya</w:t>
-            </w:r>
-          </w:p>
-        </w:tc>
-      </w:tr>
-      <w:tr>
-        <w:tc>
-          <w:tcPr>
-            <w:tcW w:type="dxa" w:w="2436"/>
-            <w:tcBorders>
-              <w:top w:val="single" w:sz="4" w:color="E8E0D5"/>
-              <w:left w:val="single" w:sz="4" w:color="E8E0D5"/>
-              <w:bottom w:val="single" w:sz="4" w:color="E8E0D5"/>
-              <w:right w:val="single" w:sz="4" w:color="E8E0D5"/>
-            </w:tcBorders>
-          </w:tcPr>
-          <w:p>
-            <w:pPr>
-              <w:spacing w:after="40" w:before="40"/>
-            </w:pPr>
-            <w:r/>
-            <w:r>
-              <w:rPr>
-                <w:rFonts w:ascii="Calibri" w:hAnsi="Calibri" w:eastAsia="Calibri"/>
-                <w:b w:val="0"/>
-                <w:i w:val="0"/>
-                <w:color w:val="1C1917"/>
-                <w:sz w:val="18"/>
-              </w:rPr>
-              <w:t>19</w:t>
-            </w:r>
-          </w:p>
-        </w:tc>
-        <w:tc>
-          <w:tcPr>
-            <w:tcW w:type="dxa" w:w="2436"/>
-            <w:tcBorders>
-              <w:top w:val="single" w:sz="4" w:color="E8E0D5"/>
-              <w:left w:val="single" w:sz="4" w:color="E8E0D5"/>
-              <w:bottom w:val="single" w:sz="4" w:color="E8E0D5"/>
-              <w:right w:val="single" w:sz="4" w:color="E8E0D5"/>
-            </w:tcBorders>
-          </w:tcPr>
-          <w:p>
-            <w:pPr>
-              <w:spacing w:after="40" w:before="40"/>
-            </w:pPr>
-            <w:r/>
-            <w:r>
-              <w:rPr>
-                <w:rFonts w:ascii="Calibri" w:hAnsi="Calibri" w:eastAsia="Calibri"/>
-                <w:b w:val="0"/>
-                <w:i w:val="0"/>
-                <w:color w:val="1C1917"/>
-                <w:sz w:val="18"/>
-              </w:rPr>
-              <w:t>Setelah satu kali terhubung internet, saya bisa lanjut memakai SiapKerja tanpa sinyal.</w:t>
-            </w:r>
-          </w:p>
-        </w:tc>
-        <w:tc>
-          <w:tcPr>
-            <w:tcW w:type="dxa" w:w="2436"/>
-            <w:tcBorders>
-              <w:top w:val="single" w:sz="4" w:color="E8E0D5"/>
-              <w:left w:val="single" w:sz="4" w:color="E8E0D5"/>
-              <w:bottom w:val="single" w:sz="4" w:color="E8E0D5"/>
-              <w:right w:val="single" w:sz="4" w:color="E8E0D5"/>
-            </w:tcBorders>
-          </w:tcPr>
-          <w:p>
-            <w:pPr>
-              <w:spacing w:after="40" w:before="40"/>
-            </w:pPr>
-            <w:r/>
-            <w:r>
-              <w:rPr>
-                <w:rFonts w:ascii="Calibri" w:hAnsi="Calibri" w:eastAsia="Calibri"/>
-                <w:b w:val="0"/>
-                <w:i w:val="0"/>
-                <w:color w:val="1C1917"/>
-                <w:sz w:val="18"/>
-              </w:rPr>
-              <w:t>Likert 1–5</w:t>
-            </w:r>
-          </w:p>
-        </w:tc>
-        <w:tc>
-          <w:tcPr>
-            <w:tcW w:type="dxa" w:w="2436"/>
-            <w:tcBorders>
-              <w:top w:val="single" w:sz="4" w:color="E8E0D5"/>
-              <w:left w:val="single" w:sz="4" w:color="E8E0D5"/>
-              <w:bottom w:val="single" w:sz="4" w:color="E8E0D5"/>
-              <w:right w:val="single" w:sz="4" w:color="E8E0D5"/>
-            </w:tcBorders>
-          </w:tcPr>
-          <w:p>
-            <w:pPr>
-              <w:spacing w:after="40" w:before="40"/>
-            </w:pPr>
-            <w:r/>
-            <w:r>
-              <w:rPr>
-                <w:rFonts w:ascii="Calibri" w:hAnsi="Calibri" w:eastAsia="Calibri"/>
-                <w:b w:val="0"/>
-                <w:i w:val="0"/>
-                <w:color w:val="1C1917"/>
-                <w:sz w:val="18"/>
-              </w:rPr>
-              <w:t>ya</w:t>
-            </w:r>
-          </w:p>
-        </w:tc>
-      </w:tr>
-      <w:tr>
-        <w:tc>
-          <w:tcPr>
-            <w:tcW w:type="dxa" w:w="2436"/>
-            <w:tcBorders>
-              <w:top w:val="single" w:sz="4" w:color="E8E0D5"/>
-              <w:left w:val="single" w:sz="4" w:color="E8E0D5"/>
-              <w:bottom w:val="single" w:sz="4" w:color="E8E0D5"/>
-              <w:right w:val="single" w:sz="4" w:color="E8E0D5"/>
-            </w:tcBorders>
-            <w:shd w:fill="F7F3EE" w:val="clear"/>
-          </w:tcPr>
-          <w:p>
-            <w:pPr>
-              <w:spacing w:after="40" w:before="40"/>
-            </w:pPr>
-            <w:r/>
-            <w:r>
-              <w:rPr>
-                <w:rFonts w:ascii="Calibri" w:hAnsi="Calibri" w:eastAsia="Calibri"/>
-                <w:b w:val="0"/>
-                <w:i w:val="0"/>
-                <w:color w:val="1C1917"/>
-                <w:sz w:val="18"/>
-              </w:rPr>
-              <w:t>20</w:t>
-            </w:r>
-          </w:p>
-        </w:tc>
-        <w:tc>
-          <w:tcPr>
-            <w:tcW w:type="dxa" w:w="2436"/>
-            <w:tcBorders>
-              <w:top w:val="single" w:sz="4" w:color="E8E0D5"/>
-              <w:left w:val="single" w:sz="4" w:color="E8E0D5"/>
-              <w:bottom w:val="single" w:sz="4" w:color="E8E0D5"/>
-              <w:right w:val="single" w:sz="4" w:color="E8E0D5"/>
-            </w:tcBorders>
-            <w:shd w:fill="F7F3EE" w:val="clear"/>
-          </w:tcPr>
-          <w:p>
-            <w:pPr>
-              <w:spacing w:after="40" w:before="40"/>
-            </w:pPr>
-            <w:r/>
-            <w:r>
-              <w:rPr>
-                <w:rFonts w:ascii="Calibri" w:hAnsi="Calibri" w:eastAsia="Calibri"/>
-                <w:b w:val="0"/>
-                <w:i w:val="0"/>
-                <w:color w:val="1C1917"/>
-                <w:sz w:val="18"/>
-              </w:rPr>
-              <w:t>SiapKerja cocok untuk pelatihan LPS di organisasi saya.</w:t>
-            </w:r>
-          </w:p>
-        </w:tc>
-        <w:tc>
-          <w:tcPr>
-            <w:tcW w:type="dxa" w:w="2436"/>
-            <w:tcBorders>
-              <w:top w:val="single" w:sz="4" w:color="E8E0D5"/>
-              <w:left w:val="single" w:sz="4" w:color="E8E0D5"/>
-              <w:bottom w:val="single" w:sz="4" w:color="E8E0D5"/>
-              <w:right w:val="single" w:sz="4" w:color="E8E0D5"/>
-            </w:tcBorders>
-            <w:shd w:fill="F7F3EE" w:val="clear"/>
-          </w:tcPr>
-          <w:p>
-            <w:pPr>
-              <w:spacing w:after="40" w:before="40"/>
-            </w:pPr>
-            <w:r/>
-            <w:r>
-              <w:rPr>
-                <w:rFonts w:ascii="Calibri" w:hAnsi="Calibri" w:eastAsia="Calibri"/>
-                <w:b w:val="0"/>
-                <w:i w:val="0"/>
-                <w:color w:val="1C1917"/>
-                <w:sz w:val="18"/>
-              </w:rPr>
-              <w:t>Likert 1–5</w:t>
-            </w:r>
-          </w:p>
-        </w:tc>
-        <w:tc>
-          <w:tcPr>
-            <w:tcW w:type="dxa" w:w="2436"/>
-            <w:tcBorders>
-              <w:top w:val="single" w:sz="4" w:color="E8E0D5"/>
-              <w:left w:val="single" w:sz="4" w:color="E8E0D5"/>
-              <w:bottom w:val="single" w:sz="4" w:color="E8E0D5"/>
-              <w:right w:val="single" w:sz="4" w:color="E8E0D5"/>
-            </w:tcBorders>
-            <w:shd w:fill="F7F3EE" w:val="clear"/>
-          </w:tcPr>
-          <w:p>
-            <w:pPr>
-              <w:spacing w:after="40" w:before="40"/>
-            </w:pPr>
-            <w:r/>
-            <w:r>
-              <w:rPr>
-                <w:rFonts w:ascii="Calibri" w:hAnsi="Calibri" w:eastAsia="Calibri"/>
-                <w:b w:val="0"/>
-                <w:i w:val="0"/>
-                <w:color w:val="1C1917"/>
-                <w:sz w:val="18"/>
-              </w:rPr>
-              <w:t>ya</w:t>
-            </w:r>
-          </w:p>
-        </w:tc>
-      </w:tr>
-      <w:tr>
-        <w:tc>
-          <w:tcPr>
-            <w:tcW w:type="dxa" w:w="2436"/>
-            <w:tcBorders>
-              <w:top w:val="single" w:sz="4" w:color="E8E0D5"/>
-              <w:left w:val="single" w:sz="4" w:color="E8E0D5"/>
-              <w:bottom w:val="single" w:sz="4" w:color="E8E0D5"/>
-              <w:right w:val="single" w:sz="4" w:color="E8E0D5"/>
-            </w:tcBorders>
-          </w:tcPr>
-          <w:p>
-            <w:pPr>
-              <w:spacing w:after="40" w:before="40"/>
-            </w:pPr>
-            <w:r/>
-            <w:r>
-              <w:rPr>
-                <w:rFonts w:ascii="Calibri" w:hAnsi="Calibri" w:eastAsia="Calibri"/>
-                <w:b w:val="0"/>
-                <w:i w:val="0"/>
-                <w:color w:val="1C1917"/>
-                <w:sz w:val="18"/>
-              </w:rPr>
-              <w:t>21</w:t>
-            </w:r>
-          </w:p>
-        </w:tc>
-        <w:tc>
-          <w:tcPr>
-            <w:tcW w:type="dxa" w:w="2436"/>
-            <w:tcBorders>
-              <w:top w:val="single" w:sz="4" w:color="E8E0D5"/>
-              <w:left w:val="single" w:sz="4" w:color="E8E0D5"/>
-              <w:bottom w:val="single" w:sz="4" w:color="E8E0D5"/>
-              <w:right w:val="single" w:sz="4" w:color="E8E0D5"/>
-            </w:tcBorders>
-          </w:tcPr>
-          <w:p>
-            <w:pPr>
-              <w:spacing w:after="40" w:before="40"/>
-            </w:pPr>
-            <w:r/>
-            <w:r>
-              <w:rPr>
-                <w:rFonts w:ascii="Calibri" w:hAnsi="Calibri" w:eastAsia="Calibri"/>
-                <w:b w:val="0"/>
-                <w:i w:val="0"/>
-                <w:color w:val="1C1917"/>
-                <w:sz w:val="18"/>
-              </w:rPr>
-              <w:t>SiapKerja bisa dipakai rekan di tempat yang internetnya putus-nyambung.</w:t>
-            </w:r>
-          </w:p>
-        </w:tc>
-        <w:tc>
-          <w:tcPr>
-            <w:tcW w:type="dxa" w:w="2436"/>
-            <w:tcBorders>
-              <w:top w:val="single" w:sz="4" w:color="E8E0D5"/>
-              <w:left w:val="single" w:sz="4" w:color="E8E0D5"/>
-              <w:bottom w:val="single" w:sz="4" w:color="E8E0D5"/>
-              <w:right w:val="single" w:sz="4" w:color="E8E0D5"/>
-            </w:tcBorders>
-          </w:tcPr>
-          <w:p>
-            <w:pPr>
-              <w:spacing w:after="40" w:before="40"/>
-            </w:pPr>
-            <w:r/>
-            <w:r>
-              <w:rPr>
-                <w:rFonts w:ascii="Calibri" w:hAnsi="Calibri" w:eastAsia="Calibri"/>
-                <w:b w:val="0"/>
-                <w:i w:val="0"/>
-                <w:color w:val="1C1917"/>
-                <w:sz w:val="18"/>
-              </w:rPr>
-              <w:t>Likert 1–5</w:t>
-            </w:r>
-          </w:p>
-        </w:tc>
-        <w:tc>
-          <w:tcPr>
-            <w:tcW w:type="dxa" w:w="2436"/>
-            <w:tcBorders>
-              <w:top w:val="single" w:sz="4" w:color="E8E0D5"/>
-              <w:left w:val="single" w:sz="4" w:color="E8E0D5"/>
-              <w:bottom w:val="single" w:sz="4" w:color="E8E0D5"/>
-              <w:right w:val="single" w:sz="4" w:color="E8E0D5"/>
-            </w:tcBorders>
-          </w:tcPr>
-          <w:p>
-            <w:pPr>
-              <w:spacing w:after="40" w:before="40"/>
-            </w:pPr>
-            <w:r/>
-            <w:r>
-              <w:rPr>
-                <w:rFonts w:ascii="Calibri" w:hAnsi="Calibri" w:eastAsia="Calibri"/>
-                <w:b w:val="0"/>
-                <w:i w:val="0"/>
-                <w:color w:val="1C1917"/>
-                <w:sz w:val="18"/>
-              </w:rPr>
-              <w:t>ya</w:t>
-            </w:r>
-          </w:p>
-        </w:tc>
-      </w:tr>
-      <w:tr>
-        <w:tc>
-          <w:tcPr>
-            <w:tcW w:type="dxa" w:w="2436"/>
-            <w:tcBorders>
-              <w:top w:val="single" w:sz="4" w:color="E8E0D5"/>
-              <w:left w:val="single" w:sz="4" w:color="E8E0D5"/>
-              <w:bottom w:val="single" w:sz="4" w:color="E8E0D5"/>
-              <w:right w:val="single" w:sz="4" w:color="E8E0D5"/>
-            </w:tcBorders>
-            <w:shd w:fill="F7F3EE" w:val="clear"/>
-          </w:tcPr>
-          <w:p>
-            <w:pPr>
-              <w:spacing w:after="40" w:before="40"/>
-            </w:pPr>
-            <w:r/>
-            <w:r>
-              <w:rPr>
-                <w:rFonts w:ascii="Calibri" w:hAnsi="Calibri" w:eastAsia="Calibri"/>
-                <w:b w:val="0"/>
-                <w:i w:val="0"/>
-                <w:color w:val="1C1917"/>
-                <w:sz w:val="18"/>
-              </w:rPr>
-              <w:t>22</w:t>
+              <w:t>12</w:t>
             </w:r>
           </w:p>
         </w:tc>
@@ -5446,7 +4212,7 @@
                 <w:color w:val="1C1917"/>
                 <w:sz w:val="18"/>
               </w:rPr>
-              <w:t>23</w:t>
+              <w:t>13</w:t>
             </w:r>
           </w:p>
         </w:tc>
@@ -5667,7 +4433,7 @@
                 <w:color w:val="1C1917"/>
                 <w:sz w:val="18"/>
               </w:rPr>
-              <w:t>24</w:t>
+              <w:t>14</w:t>
             </w:r>
           </w:p>
         </w:tc>
@@ -5778,7 +4544,7 @@
                 <w:color w:val="1C1917"/>
                 <w:sz w:val="18"/>
               </w:rPr>
-              <w:t>25</w:t>
+              <w:t>15</w:t>
             </w:r>
           </w:p>
         </w:tc>
@@ -5867,116 +4633,6 @@
           </w:p>
         </w:tc>
       </w:tr>
-      <w:tr>
-        <w:tc>
-          <w:tcPr>
-            <w:tcW w:type="dxa" w:w="2436"/>
-            <w:tcBorders>
-              <w:top w:val="single" w:sz="4" w:color="E8E0D5"/>
-              <w:left w:val="single" w:sz="4" w:color="E8E0D5"/>
-              <w:bottom w:val="single" w:sz="4" w:color="E8E0D5"/>
-              <w:right w:val="single" w:sz="4" w:color="E8E0D5"/>
-            </w:tcBorders>
-          </w:tcPr>
-          <w:p>
-            <w:pPr>
-              <w:spacing w:after="40" w:before="40"/>
-            </w:pPr>
-            <w:r/>
-            <w:r>
-              <w:rPr>
-                <w:rFonts w:ascii="Calibri" w:hAnsi="Calibri" w:eastAsia="Calibri"/>
-                <w:b w:val="0"/>
-                <w:i w:val="0"/>
-                <w:color w:val="1C1917"/>
-                <w:sz w:val="18"/>
-              </w:rPr>
-              <w:t>26</w:t>
-            </w:r>
-          </w:p>
-        </w:tc>
-        <w:tc>
-          <w:tcPr>
-            <w:tcW w:type="dxa" w:w="2436"/>
-            <w:tcBorders>
-              <w:top w:val="single" w:sz="4" w:color="E8E0D5"/>
-              <w:left w:val="single" w:sz="4" w:color="E8E0D5"/>
-              <w:bottom w:val="single" w:sz="4" w:color="E8E0D5"/>
-              <w:right w:val="single" w:sz="4" w:color="E8E0D5"/>
-            </w:tcBorders>
-          </w:tcPr>
-          <w:p>
-            <w:pPr>
-              <w:spacing w:after="40" w:before="40"/>
-            </w:pPr>
-            <w:r/>
-            <w:r>
-              <w:rPr>
-                <w:rFonts w:ascii="Calibri" w:hAnsi="Calibri" w:eastAsia="Calibri"/>
-                <w:b w:val="0"/>
-                <w:i w:val="0"/>
-                <w:color w:val="1C1917"/>
-                <w:sz w:val="18"/>
-              </w:rPr>
-              <w:t>Saran perbaikan SiapKerja. Jika tidak ada, tulis Tidak ada.</w:t>
-            </w:r>
-          </w:p>
-        </w:tc>
-        <w:tc>
-          <w:tcPr>
-            <w:tcW w:type="dxa" w:w="2436"/>
-            <w:tcBorders>
-              <w:top w:val="single" w:sz="4" w:color="E8E0D5"/>
-              <w:left w:val="single" w:sz="4" w:color="E8E0D5"/>
-              <w:bottom w:val="single" w:sz="4" w:color="E8E0D5"/>
-              <w:right w:val="single" w:sz="4" w:color="E8E0D5"/>
-            </w:tcBorders>
-          </w:tcPr>
-          <w:p>
-            <w:pPr>
-              <w:spacing w:after="40" w:before="40"/>
-            </w:pPr>
-            <w:r/>
-            <w:r>
-              <w:rPr>
-                <w:rFonts w:ascii="Calibri" w:hAnsi="Calibri" w:eastAsia="Calibri"/>
-                <w:b w:val="0"/>
-                <w:i w:val="0"/>
-                <w:color w:val="1C1917"/>
-                <w:sz w:val="18"/>
-              </w:rPr>
-              <w:t>isian panjang</w:t>
-            </w:r>
-          </w:p>
-        </w:tc>
-        <w:tc>
-          <w:tcPr>
-            <w:tcW w:type="dxa" w:w="2436"/>
-            <w:tcBorders>
-              <w:top w:val="single" w:sz="4" w:color="E8E0D5"/>
-              <w:left w:val="single" w:sz="4" w:color="E8E0D5"/>
-              <w:bottom w:val="single" w:sz="4" w:color="E8E0D5"/>
-              <w:right w:val="single" w:sz="4" w:color="E8E0D5"/>
-            </w:tcBorders>
-          </w:tcPr>
-          <w:p>
-            <w:pPr>
-              <w:spacing w:after="40" w:before="40"/>
-            </w:pPr>
-            <w:r/>
-            <w:r>
-              <w:rPr>
-                <w:rFonts w:ascii="Calibri" w:hAnsi="Calibri" w:eastAsia="Calibri"/>
-                <w:b w:val="0"/>
-                <w:i w:val="0"/>
-                <w:color w:val="1C1917"/>
-                <w:sz w:val="18"/>
-              </w:rPr>
-              <w:t>ya</w:t>
-            </w:r>
-          </w:p>
-        </w:tc>
-      </w:tr>
     </w:tbl>
     <w:p>
       <w:pPr>
@@ -5995,7 +4651,7 @@
           <w:color w:val="57534E"/>
           <w:sz w:val="20"/>
         </w:rPr>
-        <w:t>Kunci olah (jangan tampilkan di Form): butir 12, 13, 15, 16 terbalik. Indeks LPS pasca = rata-rata 12–17. Representasi pekerjaan = mean 3–6. Metode terasa = mean 7–11. Kegunaan SiapKerja = mean 18–23.</w:t>
+        <w:t>Kunci olah (jangan tampilkan di Form): butir 8, 9, 10 terbalik. Indeks LPS pasca = rata-rata 8–11. Representasi pekerjaan = mean 4–5. Metode terasa = mean 6–7. Kegunaan SiapKerja = mean 12–13.</w:t>
       </w:r>
     </w:p>
     <w:p>
@@ -6011,7 +4667,7 @@
           <w:color w:val="9A4519"/>
           <w:sz w:val="28"/>
         </w:rPr>
-        <w:t>Form 3 — Lembar pengamat</w:t>
+        <w:t>Form 3 — Lembar pengamat (12 butir)</w:t>
       </w:r>
     </w:p>
     <w:p>
@@ -6051,7 +4707,7 @@
           <w:color w:val="1C1917"/>
           <w:sz w:val="22"/>
         </w:rPr>
-        <w:t>Satu isian per kelompok. Catat apa yang terjadi di SiapKerja. Jangan tulis nama orang atau nama instansi. Kode sesi contoh S260825-A.</w:t>
+        <w:t>Satu isian per kelompok / laptop. Catat apa yang terjadi di SiapKerja. Jangan tulis nama orang. Nama organisasi diisi; di paper akan disamarkan. Kode sesi contoh S260901-A.</w:t>
       </w:r>
     </w:p>
     <w:tbl>
@@ -6232,7 +4888,7 @@
                 <w:color w:val="1C1917"/>
                 <w:sz w:val="18"/>
               </w:rPr>
-              <w:t>Kode sesi (contoh S260825-A)</w:t>
+              <w:t>Kode sesi (contoh S260901-A)</w:t>
             </w:r>
           </w:p>
         </w:tc>
@@ -6344,7 +5000,7 @@
                 <w:color w:val="1C1917"/>
                 <w:sz w:val="18"/>
               </w:rPr>
-              <w:t>Kode kelompok (contoh G2)</w:t>
+              <w:t>Nama organisasi atau perusahaan. Di paper akan disamarkan. Jika tidak mewakili organisasi, tulis Individu.</w:t>
             </w:r>
           </w:p>
         </w:tc>
@@ -6456,7 +5112,7 @@
                 <w:color w:val="1C1917"/>
                 <w:sz w:val="18"/>
               </w:rPr>
-              <w:t>Jumlah orang di laptop ini</w:t>
+              <w:t>Kode kelompok / laptop (contoh G2)</w:t>
             </w:r>
           </w:p>
         </w:tc>
@@ -6483,7 +5139,7 @@
                 <w:color w:val="1C1917"/>
                 <w:sz w:val="18"/>
               </w:rPr>
-              <w:t>pilihan: 2 / 3 / 4 / 5 / 6 atau lebih</w:t>
+              <w:t>isian singkat</w:t>
             </w:r>
           </w:p>
         </w:tc>
@@ -6568,7 +5224,7 @@
                 <w:color w:val="1C1917"/>
                 <w:sz w:val="18"/>
               </w:rPr>
-              <w:t>Jam mulai (contoh 09.00)</w:t>
+              <w:t>Jumlah orang di laptop ini</w:t>
             </w:r>
           </w:p>
         </w:tc>
@@ -6596,7 +5252,7 @@
                 <w:color w:val="1C1917"/>
                 <w:sz w:val="18"/>
               </w:rPr>
-              <w:t>isian singkat</w:t>
+              <w:t>pilihan: 2 / 3 / 4 / 5 / 6 atau lebih</w:t>
             </w:r>
           </w:p>
         </w:tc>
@@ -6680,7 +5336,7 @@
                 <w:color w:val="1C1917"/>
                 <w:sz w:val="18"/>
               </w:rPr>
-              <w:t>Jam selesai (contoh 10.30)</w:t>
+              <w:t>Tab terakhir yang tercapai di SiapKerja</w:t>
             </w:r>
           </w:p>
         </w:tc>
@@ -6707,7 +5363,7 @@
                 <w:color w:val="1C1917"/>
                 <w:sz w:val="18"/>
               </w:rPr>
-              <w:t>isian singkat</w:t>
+              <w:t>pilihan: Pemilik / Desainer / Pemilihan / Master Plan / Phase Plan / Look-ahead / Weekly Work Plan / Huddle / Learning / Laporan</w:t>
             </w:r>
           </w:p>
         </w:tc>
@@ -6792,7 +5448,7 @@
                 <w:color w:val="1C1917"/>
                 <w:sz w:val="18"/>
               </w:rPr>
-              <w:t>Tab Pemilik selesai dikunci?</w:t>
+              <w:t>L1 pernah dikunci dalam keadaan kotor (masih ada kendala)?</w:t>
             </w:r>
           </w:p>
         </w:tc>
@@ -6820,7 +5476,7 @@
                 <w:color w:val="1C1917"/>
                 <w:sz w:val="18"/>
               </w:rPr>
-              <w:t>Ya / Tidak</w:t>
+              <w:t>Ya / Tidak / Tidak sempat</w:t>
             </w:r>
           </w:p>
         </w:tc>
@@ -6904,7 +5560,7 @@
                 <w:color w:val="1C1917"/>
                 <w:sz w:val="18"/>
               </w:rPr>
-              <w:t>Tab Desainer selesai dikunci?</w:t>
+              <w:t>Kelompok memperbaiki L1 sebelum berjanji di Weekly Work Plan?</w:t>
             </w:r>
           </w:p>
         </w:tc>
@@ -6931,7 +5587,7 @@
                 <w:color w:val="1C1917"/>
                 <w:sz w:val="18"/>
               </w:rPr>
-              <w:t>Ya / Tidak</w:t>
+              <w:t>Ya / Tidak / Tidak sempat</w:t>
             </w:r>
           </w:p>
         </w:tc>
@@ -7016,7 +5672,7 @@
                 <w:color w:val="1C1917"/>
                 <w:sz w:val="18"/>
               </w:rPr>
-              <w:t>Tab Pemilihan (tanda tangan kontrak) selesai?</w:t>
+              <w:t>Huddle dijalankan minimal satu hari?</w:t>
             </w:r>
           </w:p>
         </w:tc>
@@ -7044,7 +5700,7 @@
                 <w:color w:val="1C1917"/>
                 <w:sz w:val="18"/>
               </w:rPr>
-              <w:t>Ya / Tidak</w:t>
+              <w:t>Ya / Tidak / Tidak sempat</w:t>
             </w:r>
           </w:p>
         </w:tc>
@@ -7128,7 +5784,7 @@
                 <w:color w:val="1C1917"/>
                 <w:sz w:val="18"/>
               </w:rPr>
-              <w:t>Tab Master Plan dibuka?</w:t>
+              <w:t>Kelompok membahas keandalan janji atau PPC di Learning atau Laporan?</w:t>
             </w:r>
           </w:p>
         </w:tc>
@@ -7155,7 +5811,7 @@
                 <w:color w:val="1C1917"/>
                 <w:sz w:val="18"/>
               </w:rPr>
-              <w:t>Ya / Tidak</w:t>
+              <w:t>Ya / Tidak / Tidak sempat</w:t>
             </w:r>
           </w:p>
         </w:tc>
@@ -7240,903 +5896,7 @@
                 <w:color w:val="1C1917"/>
                 <w:sz w:val="18"/>
               </w:rPr>
-              <w:t>Phase Plan selesai (pull Pondasi dan Struktur plus komitmen)?</w:t>
-            </w:r>
-          </w:p>
-        </w:tc>
-        <w:tc>
-          <w:tcPr>
-            <w:tcW w:type="dxa" w:w="2436"/>
-            <w:tcBorders>
-              <w:top w:val="single" w:sz="4" w:color="E8E0D5"/>
-              <w:left w:val="single" w:sz="4" w:color="E8E0D5"/>
-              <w:bottom w:val="single" w:sz="4" w:color="E8E0D5"/>
-              <w:right w:val="single" w:sz="4" w:color="E8E0D5"/>
-            </w:tcBorders>
-            <w:shd w:fill="F7F3EE" w:val="clear"/>
-          </w:tcPr>
-          <w:p>
-            <w:pPr>
-              <w:spacing w:after="40" w:before="40"/>
-            </w:pPr>
-            <w:r/>
-            <w:r>
-              <w:rPr>
-                <w:rFonts w:ascii="Calibri" w:hAnsi="Calibri" w:eastAsia="Calibri"/>
-                <w:b w:val="0"/>
-                <w:i w:val="0"/>
-                <w:color w:val="1C1917"/>
-                <w:sz w:val="18"/>
-              </w:rPr>
-              <w:t>Ya / Tidak</w:t>
-            </w:r>
-          </w:p>
-        </w:tc>
-        <w:tc>
-          <w:tcPr>
-            <w:tcW w:type="dxa" w:w="2436"/>
-            <w:tcBorders>
-              <w:top w:val="single" w:sz="4" w:color="E8E0D5"/>
-              <w:left w:val="single" w:sz="4" w:color="E8E0D5"/>
-              <w:bottom w:val="single" w:sz="4" w:color="E8E0D5"/>
-              <w:right w:val="single" w:sz="4" w:color="E8E0D5"/>
-            </w:tcBorders>
-            <w:shd w:fill="F7F3EE" w:val="clear"/>
-          </w:tcPr>
-          <w:p>
-            <w:pPr>
-              <w:spacing w:after="40" w:before="40"/>
-            </w:pPr>
-            <w:r/>
-            <w:r>
-              <w:rPr>
-                <w:rFonts w:ascii="Calibri" w:hAnsi="Calibri" w:eastAsia="Calibri"/>
-                <w:b w:val="0"/>
-                <w:i w:val="0"/>
-                <w:color w:val="1C1917"/>
-                <w:sz w:val="18"/>
-              </w:rPr>
-              <w:t>ya</w:t>
-            </w:r>
-          </w:p>
-        </w:tc>
-      </w:tr>
-      <w:tr>
-        <w:tc>
-          <w:tcPr>
-            <w:tcW w:type="dxa" w:w="2436"/>
-            <w:tcBorders>
-              <w:top w:val="single" w:sz="4" w:color="E8E0D5"/>
-              <w:left w:val="single" w:sz="4" w:color="E8E0D5"/>
-              <w:bottom w:val="single" w:sz="4" w:color="E8E0D5"/>
-              <w:right w:val="single" w:sz="4" w:color="E8E0D5"/>
-            </w:tcBorders>
-          </w:tcPr>
-          <w:p>
-            <w:pPr>
-              <w:spacing w:after="40" w:before="40"/>
-            </w:pPr>
-            <w:r/>
-            <w:r>
-              <w:rPr>
-                <w:rFonts w:ascii="Calibri" w:hAnsi="Calibri" w:eastAsia="Calibri"/>
-                <w:b w:val="0"/>
-                <w:i w:val="0"/>
-                <w:color w:val="1C1917"/>
-                <w:sz w:val="18"/>
-              </w:rPr>
-              <w:t>11</w:t>
-            </w:r>
-          </w:p>
-        </w:tc>
-        <w:tc>
-          <w:tcPr>
-            <w:tcW w:type="dxa" w:w="2436"/>
-            <w:tcBorders>
-              <w:top w:val="single" w:sz="4" w:color="E8E0D5"/>
-              <w:left w:val="single" w:sz="4" w:color="E8E0D5"/>
-              <w:bottom w:val="single" w:sz="4" w:color="E8E0D5"/>
-              <w:right w:val="single" w:sz="4" w:color="E8E0D5"/>
-            </w:tcBorders>
-          </w:tcPr>
-          <w:p>
-            <w:pPr>
-              <w:spacing w:after="40" w:before="40"/>
-            </w:pPr>
-            <w:r/>
-            <w:r>
-              <w:rPr>
-                <w:rFonts w:ascii="Calibri" w:hAnsi="Calibri" w:eastAsia="Calibri"/>
-                <w:b w:val="0"/>
-                <w:i w:val="0"/>
-                <w:color w:val="1C1917"/>
-                <w:sz w:val="18"/>
-              </w:rPr>
-              <w:t>Look-ahead: L1 sudah SiapKerja (bebas kendala)?</w:t>
-            </w:r>
-          </w:p>
-        </w:tc>
-        <w:tc>
-          <w:tcPr>
-            <w:tcW w:type="dxa" w:w="2436"/>
-            <w:tcBorders>
-              <w:top w:val="single" w:sz="4" w:color="E8E0D5"/>
-              <w:left w:val="single" w:sz="4" w:color="E8E0D5"/>
-              <w:bottom w:val="single" w:sz="4" w:color="E8E0D5"/>
-              <w:right w:val="single" w:sz="4" w:color="E8E0D5"/>
-            </w:tcBorders>
-          </w:tcPr>
-          <w:p>
-            <w:pPr>
-              <w:spacing w:after="40" w:before="40"/>
-            </w:pPr>
-            <w:r/>
-            <w:r>
-              <w:rPr>
-                <w:rFonts w:ascii="Calibri" w:hAnsi="Calibri" w:eastAsia="Calibri"/>
-                <w:b w:val="0"/>
-                <w:i w:val="0"/>
-                <w:color w:val="1C1917"/>
-                <w:sz w:val="18"/>
-              </w:rPr>
-              <w:t>Ya / Tidak</w:t>
-            </w:r>
-          </w:p>
-        </w:tc>
-        <w:tc>
-          <w:tcPr>
-            <w:tcW w:type="dxa" w:w="2436"/>
-            <w:tcBorders>
-              <w:top w:val="single" w:sz="4" w:color="E8E0D5"/>
-              <w:left w:val="single" w:sz="4" w:color="E8E0D5"/>
-              <w:bottom w:val="single" w:sz="4" w:color="E8E0D5"/>
-              <w:right w:val="single" w:sz="4" w:color="E8E0D5"/>
-            </w:tcBorders>
-          </w:tcPr>
-          <w:p>
-            <w:pPr>
-              <w:spacing w:after="40" w:before="40"/>
-            </w:pPr>
-            <w:r/>
-            <w:r>
-              <w:rPr>
-                <w:rFonts w:ascii="Calibri" w:hAnsi="Calibri" w:eastAsia="Calibri"/>
-                <w:b w:val="0"/>
-                <w:i w:val="0"/>
-                <w:color w:val="1C1917"/>
-                <w:sz w:val="18"/>
-              </w:rPr>
-              <w:t>ya</w:t>
-            </w:r>
-          </w:p>
-        </w:tc>
-      </w:tr>
-      <w:tr>
-        <w:tc>
-          <w:tcPr>
-            <w:tcW w:type="dxa" w:w="2436"/>
-            <w:tcBorders>
-              <w:top w:val="single" w:sz="4" w:color="E8E0D5"/>
-              <w:left w:val="single" w:sz="4" w:color="E8E0D5"/>
-              <w:bottom w:val="single" w:sz="4" w:color="E8E0D5"/>
-              <w:right w:val="single" w:sz="4" w:color="E8E0D5"/>
-            </w:tcBorders>
-            <w:shd w:fill="F7F3EE" w:val="clear"/>
-          </w:tcPr>
-          <w:p>
-            <w:pPr>
-              <w:spacing w:after="40" w:before="40"/>
-            </w:pPr>
-            <w:r/>
-            <w:r>
-              <w:rPr>
-                <w:rFonts w:ascii="Calibri" w:hAnsi="Calibri" w:eastAsia="Calibri"/>
-                <w:b w:val="0"/>
-                <w:i w:val="0"/>
-                <w:color w:val="1C1917"/>
-                <w:sz w:val="18"/>
-              </w:rPr>
-              <w:t>12</w:t>
-            </w:r>
-          </w:p>
-        </w:tc>
-        <w:tc>
-          <w:tcPr>
-            <w:tcW w:type="dxa" w:w="2436"/>
-            <w:tcBorders>
-              <w:top w:val="single" w:sz="4" w:color="E8E0D5"/>
-              <w:left w:val="single" w:sz="4" w:color="E8E0D5"/>
-              <w:bottom w:val="single" w:sz="4" w:color="E8E0D5"/>
-              <w:right w:val="single" w:sz="4" w:color="E8E0D5"/>
-            </w:tcBorders>
-            <w:shd w:fill="F7F3EE" w:val="clear"/>
-          </w:tcPr>
-          <w:p>
-            <w:pPr>
-              <w:spacing w:after="40" w:before="40"/>
-            </w:pPr>
-            <w:r/>
-            <w:r>
-              <w:rPr>
-                <w:rFonts w:ascii="Calibri" w:hAnsi="Calibri" w:eastAsia="Calibri"/>
-                <w:b w:val="0"/>
-                <w:i w:val="0"/>
-                <w:color w:val="1C1917"/>
-                <w:sz w:val="18"/>
-              </w:rPr>
-              <w:t>Weekly Work Plan dikunci?</w:t>
-            </w:r>
-          </w:p>
-        </w:tc>
-        <w:tc>
-          <w:tcPr>
-            <w:tcW w:type="dxa" w:w="2436"/>
-            <w:tcBorders>
-              <w:top w:val="single" w:sz="4" w:color="E8E0D5"/>
-              <w:left w:val="single" w:sz="4" w:color="E8E0D5"/>
-              <w:bottom w:val="single" w:sz="4" w:color="E8E0D5"/>
-              <w:right w:val="single" w:sz="4" w:color="E8E0D5"/>
-            </w:tcBorders>
-            <w:shd w:fill="F7F3EE" w:val="clear"/>
-          </w:tcPr>
-          <w:p>
-            <w:pPr>
-              <w:spacing w:after="40" w:before="40"/>
-            </w:pPr>
-            <w:r/>
-            <w:r>
-              <w:rPr>
-                <w:rFonts w:ascii="Calibri" w:hAnsi="Calibri" w:eastAsia="Calibri"/>
-                <w:b w:val="0"/>
-                <w:i w:val="0"/>
-                <w:color w:val="1C1917"/>
-                <w:sz w:val="18"/>
-              </w:rPr>
-              <w:t>Ya / Tidak</w:t>
-            </w:r>
-          </w:p>
-        </w:tc>
-        <w:tc>
-          <w:tcPr>
-            <w:tcW w:type="dxa" w:w="2436"/>
-            <w:tcBorders>
-              <w:top w:val="single" w:sz="4" w:color="E8E0D5"/>
-              <w:left w:val="single" w:sz="4" w:color="E8E0D5"/>
-              <w:bottom w:val="single" w:sz="4" w:color="E8E0D5"/>
-              <w:right w:val="single" w:sz="4" w:color="E8E0D5"/>
-            </w:tcBorders>
-            <w:shd w:fill="F7F3EE" w:val="clear"/>
-          </w:tcPr>
-          <w:p>
-            <w:pPr>
-              <w:spacing w:after="40" w:before="40"/>
-            </w:pPr>
-            <w:r/>
-            <w:r>
-              <w:rPr>
-                <w:rFonts w:ascii="Calibri" w:hAnsi="Calibri" w:eastAsia="Calibri"/>
-                <w:b w:val="0"/>
-                <w:i w:val="0"/>
-                <w:color w:val="1C1917"/>
-                <w:sz w:val="18"/>
-              </w:rPr>
-              <w:t>ya</w:t>
-            </w:r>
-          </w:p>
-        </w:tc>
-      </w:tr>
-      <w:tr>
-        <w:tc>
-          <w:tcPr>
-            <w:tcW w:type="dxa" w:w="2436"/>
-            <w:tcBorders>
-              <w:top w:val="single" w:sz="4" w:color="E8E0D5"/>
-              <w:left w:val="single" w:sz="4" w:color="E8E0D5"/>
-              <w:bottom w:val="single" w:sz="4" w:color="E8E0D5"/>
-              <w:right w:val="single" w:sz="4" w:color="E8E0D5"/>
-            </w:tcBorders>
-          </w:tcPr>
-          <w:p>
-            <w:pPr>
-              <w:spacing w:after="40" w:before="40"/>
-            </w:pPr>
-            <w:r/>
-            <w:r>
-              <w:rPr>
-                <w:rFonts w:ascii="Calibri" w:hAnsi="Calibri" w:eastAsia="Calibri"/>
-                <w:b w:val="0"/>
-                <w:i w:val="0"/>
-                <w:color w:val="1C1917"/>
-                <w:sz w:val="18"/>
-              </w:rPr>
-              <w:t>13</w:t>
-            </w:r>
-          </w:p>
-        </w:tc>
-        <w:tc>
-          <w:tcPr>
-            <w:tcW w:type="dxa" w:w="2436"/>
-            <w:tcBorders>
-              <w:top w:val="single" w:sz="4" w:color="E8E0D5"/>
-              <w:left w:val="single" w:sz="4" w:color="E8E0D5"/>
-              <w:bottom w:val="single" w:sz="4" w:color="E8E0D5"/>
-              <w:right w:val="single" w:sz="4" w:color="E8E0D5"/>
-            </w:tcBorders>
-          </w:tcPr>
-          <w:p>
-            <w:pPr>
-              <w:spacing w:after="40" w:before="40"/>
-            </w:pPr>
-            <w:r/>
-            <w:r>
-              <w:rPr>
-                <w:rFonts w:ascii="Calibri" w:hAnsi="Calibri" w:eastAsia="Calibri"/>
-                <w:b w:val="0"/>
-                <w:i w:val="0"/>
-                <w:color w:val="1C1917"/>
-                <w:sz w:val="18"/>
-              </w:rPr>
-              <w:t>Huddle dijalankan minimal satu hari?</w:t>
-            </w:r>
-          </w:p>
-        </w:tc>
-        <w:tc>
-          <w:tcPr>
-            <w:tcW w:type="dxa" w:w="2436"/>
-            <w:tcBorders>
-              <w:top w:val="single" w:sz="4" w:color="E8E0D5"/>
-              <w:left w:val="single" w:sz="4" w:color="E8E0D5"/>
-              <w:bottom w:val="single" w:sz="4" w:color="E8E0D5"/>
-              <w:right w:val="single" w:sz="4" w:color="E8E0D5"/>
-            </w:tcBorders>
-          </w:tcPr>
-          <w:p>
-            <w:pPr>
-              <w:spacing w:after="40" w:before="40"/>
-            </w:pPr>
-            <w:r/>
-            <w:r>
-              <w:rPr>
-                <w:rFonts w:ascii="Calibri" w:hAnsi="Calibri" w:eastAsia="Calibri"/>
-                <w:b w:val="0"/>
-                <w:i w:val="0"/>
-                <w:color w:val="1C1917"/>
-                <w:sz w:val="18"/>
-              </w:rPr>
-              <w:t>Ya / Tidak</w:t>
-            </w:r>
-          </w:p>
-        </w:tc>
-        <w:tc>
-          <w:tcPr>
-            <w:tcW w:type="dxa" w:w="2436"/>
-            <w:tcBorders>
-              <w:top w:val="single" w:sz="4" w:color="E8E0D5"/>
-              <w:left w:val="single" w:sz="4" w:color="E8E0D5"/>
-              <w:bottom w:val="single" w:sz="4" w:color="E8E0D5"/>
-              <w:right w:val="single" w:sz="4" w:color="E8E0D5"/>
-            </w:tcBorders>
-          </w:tcPr>
-          <w:p>
-            <w:pPr>
-              <w:spacing w:after="40" w:before="40"/>
-            </w:pPr>
-            <w:r/>
-            <w:r>
-              <w:rPr>
-                <w:rFonts w:ascii="Calibri" w:hAnsi="Calibri" w:eastAsia="Calibri"/>
-                <w:b w:val="0"/>
-                <w:i w:val="0"/>
-                <w:color w:val="1C1917"/>
-                <w:sz w:val="18"/>
-              </w:rPr>
-              <w:t>ya</w:t>
-            </w:r>
-          </w:p>
-        </w:tc>
-      </w:tr>
-      <w:tr>
-        <w:tc>
-          <w:tcPr>
-            <w:tcW w:type="dxa" w:w="2436"/>
-            <w:tcBorders>
-              <w:top w:val="single" w:sz="4" w:color="E8E0D5"/>
-              <w:left w:val="single" w:sz="4" w:color="E8E0D5"/>
-              <w:bottom w:val="single" w:sz="4" w:color="E8E0D5"/>
-              <w:right w:val="single" w:sz="4" w:color="E8E0D5"/>
-            </w:tcBorders>
-            <w:shd w:fill="F7F3EE" w:val="clear"/>
-          </w:tcPr>
-          <w:p>
-            <w:pPr>
-              <w:spacing w:after="40" w:before="40"/>
-            </w:pPr>
-            <w:r/>
-            <w:r>
-              <w:rPr>
-                <w:rFonts w:ascii="Calibri" w:hAnsi="Calibri" w:eastAsia="Calibri"/>
-                <w:b w:val="0"/>
-                <w:i w:val="0"/>
-                <w:color w:val="1C1917"/>
-                <w:sz w:val="18"/>
-              </w:rPr>
-              <w:t>14</w:t>
-            </w:r>
-          </w:p>
-        </w:tc>
-        <w:tc>
-          <w:tcPr>
-            <w:tcW w:type="dxa" w:w="2436"/>
-            <w:tcBorders>
-              <w:top w:val="single" w:sz="4" w:color="E8E0D5"/>
-              <w:left w:val="single" w:sz="4" w:color="E8E0D5"/>
-              <w:bottom w:val="single" w:sz="4" w:color="E8E0D5"/>
-              <w:right w:val="single" w:sz="4" w:color="E8E0D5"/>
-            </w:tcBorders>
-            <w:shd w:fill="F7F3EE" w:val="clear"/>
-          </w:tcPr>
-          <w:p>
-            <w:pPr>
-              <w:spacing w:after="40" w:before="40"/>
-            </w:pPr>
-            <w:r/>
-            <w:r>
-              <w:rPr>
-                <w:rFonts w:ascii="Calibri" w:hAnsi="Calibri" w:eastAsia="Calibri"/>
-                <w:b w:val="0"/>
-                <w:i w:val="0"/>
-                <w:color w:val="1C1917"/>
-                <w:sz w:val="18"/>
-              </w:rPr>
-              <w:t>Tab Learning dibuka dan PPC terlihat?</w:t>
-            </w:r>
-          </w:p>
-        </w:tc>
-        <w:tc>
-          <w:tcPr>
-            <w:tcW w:type="dxa" w:w="2436"/>
-            <w:tcBorders>
-              <w:top w:val="single" w:sz="4" w:color="E8E0D5"/>
-              <w:left w:val="single" w:sz="4" w:color="E8E0D5"/>
-              <w:bottom w:val="single" w:sz="4" w:color="E8E0D5"/>
-              <w:right w:val="single" w:sz="4" w:color="E8E0D5"/>
-            </w:tcBorders>
-            <w:shd w:fill="F7F3EE" w:val="clear"/>
-          </w:tcPr>
-          <w:p>
-            <w:pPr>
-              <w:spacing w:after="40" w:before="40"/>
-            </w:pPr>
-            <w:r/>
-            <w:r>
-              <w:rPr>
-                <w:rFonts w:ascii="Calibri" w:hAnsi="Calibri" w:eastAsia="Calibri"/>
-                <w:b w:val="0"/>
-                <w:i w:val="0"/>
-                <w:color w:val="1C1917"/>
-                <w:sz w:val="18"/>
-              </w:rPr>
-              <w:t>Ya / Tidak</w:t>
-            </w:r>
-          </w:p>
-        </w:tc>
-        <w:tc>
-          <w:tcPr>
-            <w:tcW w:type="dxa" w:w="2436"/>
-            <w:tcBorders>
-              <w:top w:val="single" w:sz="4" w:color="E8E0D5"/>
-              <w:left w:val="single" w:sz="4" w:color="E8E0D5"/>
-              <w:bottom w:val="single" w:sz="4" w:color="E8E0D5"/>
-              <w:right w:val="single" w:sz="4" w:color="E8E0D5"/>
-            </w:tcBorders>
-            <w:shd w:fill="F7F3EE" w:val="clear"/>
-          </w:tcPr>
-          <w:p>
-            <w:pPr>
-              <w:spacing w:after="40" w:before="40"/>
-            </w:pPr>
-            <w:r/>
-            <w:r>
-              <w:rPr>
-                <w:rFonts w:ascii="Calibri" w:hAnsi="Calibri" w:eastAsia="Calibri"/>
-                <w:b w:val="0"/>
-                <w:i w:val="0"/>
-                <w:color w:val="1C1917"/>
-                <w:sz w:val="18"/>
-              </w:rPr>
-              <w:t>ya</w:t>
-            </w:r>
-          </w:p>
-        </w:tc>
-      </w:tr>
-      <w:tr>
-        <w:tc>
-          <w:tcPr>
-            <w:tcW w:type="dxa" w:w="2436"/>
-            <w:tcBorders>
-              <w:top w:val="single" w:sz="4" w:color="E8E0D5"/>
-              <w:left w:val="single" w:sz="4" w:color="E8E0D5"/>
-              <w:bottom w:val="single" w:sz="4" w:color="E8E0D5"/>
-              <w:right w:val="single" w:sz="4" w:color="E8E0D5"/>
-            </w:tcBorders>
-          </w:tcPr>
-          <w:p>
-            <w:pPr>
-              <w:spacing w:after="40" w:before="40"/>
-            </w:pPr>
-            <w:r/>
-            <w:r>
-              <w:rPr>
-                <w:rFonts w:ascii="Calibri" w:hAnsi="Calibri" w:eastAsia="Calibri"/>
-                <w:b w:val="0"/>
-                <w:i w:val="0"/>
-                <w:color w:val="1C1917"/>
-                <w:sz w:val="18"/>
-              </w:rPr>
-              <w:t>15</w:t>
-            </w:r>
-          </w:p>
-        </w:tc>
-        <w:tc>
-          <w:tcPr>
-            <w:tcW w:type="dxa" w:w="2436"/>
-            <w:tcBorders>
-              <w:top w:val="single" w:sz="4" w:color="E8E0D5"/>
-              <w:left w:val="single" w:sz="4" w:color="E8E0D5"/>
-              <w:bottom w:val="single" w:sz="4" w:color="E8E0D5"/>
-              <w:right w:val="single" w:sz="4" w:color="E8E0D5"/>
-            </w:tcBorders>
-          </w:tcPr>
-          <w:p>
-            <w:pPr>
-              <w:spacing w:after="40" w:before="40"/>
-            </w:pPr>
-            <w:r/>
-            <w:r>
-              <w:rPr>
-                <w:rFonts w:ascii="Calibri" w:hAnsi="Calibri" w:eastAsia="Calibri"/>
-                <w:b w:val="0"/>
-                <w:i w:val="0"/>
-                <w:color w:val="1C1917"/>
-                <w:sz w:val="18"/>
-              </w:rPr>
-              <w:t>Tab Laporan dibuka?</w:t>
-            </w:r>
-          </w:p>
-        </w:tc>
-        <w:tc>
-          <w:tcPr>
-            <w:tcW w:type="dxa" w:w="2436"/>
-            <w:tcBorders>
-              <w:top w:val="single" w:sz="4" w:color="E8E0D5"/>
-              <w:left w:val="single" w:sz="4" w:color="E8E0D5"/>
-              <w:bottom w:val="single" w:sz="4" w:color="E8E0D5"/>
-              <w:right w:val="single" w:sz="4" w:color="E8E0D5"/>
-            </w:tcBorders>
-          </w:tcPr>
-          <w:p>
-            <w:pPr>
-              <w:spacing w:after="40" w:before="40"/>
-            </w:pPr>
-            <w:r/>
-            <w:r>
-              <w:rPr>
-                <w:rFonts w:ascii="Calibri" w:hAnsi="Calibri" w:eastAsia="Calibri"/>
-                <w:b w:val="0"/>
-                <w:i w:val="0"/>
-                <w:color w:val="1C1917"/>
-                <w:sz w:val="18"/>
-              </w:rPr>
-              <w:t>Ya / Tidak</w:t>
-            </w:r>
-          </w:p>
-        </w:tc>
-        <w:tc>
-          <w:tcPr>
-            <w:tcW w:type="dxa" w:w="2436"/>
-            <w:tcBorders>
-              <w:top w:val="single" w:sz="4" w:color="E8E0D5"/>
-              <w:left w:val="single" w:sz="4" w:color="E8E0D5"/>
-              <w:bottom w:val="single" w:sz="4" w:color="E8E0D5"/>
-              <w:right w:val="single" w:sz="4" w:color="E8E0D5"/>
-            </w:tcBorders>
-          </w:tcPr>
-          <w:p>
-            <w:pPr>
-              <w:spacing w:after="40" w:before="40"/>
-            </w:pPr>
-            <w:r/>
-            <w:r>
-              <w:rPr>
-                <w:rFonts w:ascii="Calibri" w:hAnsi="Calibri" w:eastAsia="Calibri"/>
-                <w:b w:val="0"/>
-                <w:i w:val="0"/>
-                <w:color w:val="1C1917"/>
-                <w:sz w:val="18"/>
-              </w:rPr>
-              <w:t>ya</w:t>
-            </w:r>
-          </w:p>
-        </w:tc>
-      </w:tr>
-      <w:tr>
-        <w:tc>
-          <w:tcPr>
-            <w:tcW w:type="dxa" w:w="2436"/>
-            <w:tcBorders>
-              <w:top w:val="single" w:sz="4" w:color="E8E0D5"/>
-              <w:left w:val="single" w:sz="4" w:color="E8E0D5"/>
-              <w:bottom w:val="single" w:sz="4" w:color="E8E0D5"/>
-              <w:right w:val="single" w:sz="4" w:color="E8E0D5"/>
-            </w:tcBorders>
-            <w:shd w:fill="F7F3EE" w:val="clear"/>
-          </w:tcPr>
-          <w:p>
-            <w:pPr>
-              <w:spacing w:after="40" w:before="40"/>
-            </w:pPr>
-            <w:r/>
-            <w:r>
-              <w:rPr>
-                <w:rFonts w:ascii="Calibri" w:hAnsi="Calibri" w:eastAsia="Calibri"/>
-                <w:b w:val="0"/>
-                <w:i w:val="0"/>
-                <w:color w:val="1C1917"/>
-                <w:sz w:val="18"/>
-              </w:rPr>
-              <w:t>16</w:t>
-            </w:r>
-          </w:p>
-        </w:tc>
-        <w:tc>
-          <w:tcPr>
-            <w:tcW w:type="dxa" w:w="2436"/>
-            <w:tcBorders>
-              <w:top w:val="single" w:sz="4" w:color="E8E0D5"/>
-              <w:left w:val="single" w:sz="4" w:color="E8E0D5"/>
-              <w:bottom w:val="single" w:sz="4" w:color="E8E0D5"/>
-              <w:right w:val="single" w:sz="4" w:color="E8E0D5"/>
-            </w:tcBorders>
-            <w:shd w:fill="F7F3EE" w:val="clear"/>
-          </w:tcPr>
-          <w:p>
-            <w:pPr>
-              <w:spacing w:after="40" w:before="40"/>
-            </w:pPr>
-            <w:r/>
-            <w:r>
-              <w:rPr>
-                <w:rFonts w:ascii="Calibri" w:hAnsi="Calibri" w:eastAsia="Calibri"/>
-                <w:b w:val="0"/>
-                <w:i w:val="0"/>
-                <w:color w:val="1C1917"/>
-                <w:sz w:val="18"/>
-              </w:rPr>
-              <w:t>Kelompok sempat gulir sampai skrip material (sekitar minggu 3)?</w:t>
-            </w:r>
-          </w:p>
-        </w:tc>
-        <w:tc>
-          <w:tcPr>
-            <w:tcW w:type="dxa" w:w="2436"/>
-            <w:tcBorders>
-              <w:top w:val="single" w:sz="4" w:color="E8E0D5"/>
-              <w:left w:val="single" w:sz="4" w:color="E8E0D5"/>
-              <w:bottom w:val="single" w:sz="4" w:color="E8E0D5"/>
-              <w:right w:val="single" w:sz="4" w:color="E8E0D5"/>
-            </w:tcBorders>
-            <w:shd w:fill="F7F3EE" w:val="clear"/>
-          </w:tcPr>
-          <w:p>
-            <w:pPr>
-              <w:spacing w:after="40" w:before="40"/>
-            </w:pPr>
-            <w:r/>
-            <w:r>
-              <w:rPr>
-                <w:rFonts w:ascii="Calibri" w:hAnsi="Calibri" w:eastAsia="Calibri"/>
-                <w:b w:val="0"/>
-                <w:i w:val="0"/>
-                <w:color w:val="1C1917"/>
-                <w:sz w:val="18"/>
-              </w:rPr>
-              <w:t>Ya / Tidak</w:t>
-            </w:r>
-          </w:p>
-        </w:tc>
-        <w:tc>
-          <w:tcPr>
-            <w:tcW w:type="dxa" w:w="2436"/>
-            <w:tcBorders>
-              <w:top w:val="single" w:sz="4" w:color="E8E0D5"/>
-              <w:left w:val="single" w:sz="4" w:color="E8E0D5"/>
-              <w:bottom w:val="single" w:sz="4" w:color="E8E0D5"/>
-              <w:right w:val="single" w:sz="4" w:color="E8E0D5"/>
-            </w:tcBorders>
-            <w:shd w:fill="F7F3EE" w:val="clear"/>
-          </w:tcPr>
-          <w:p>
-            <w:pPr>
-              <w:spacing w:after="40" w:before="40"/>
-            </w:pPr>
-            <w:r/>
-            <w:r>
-              <w:rPr>
-                <w:rFonts w:ascii="Calibri" w:hAnsi="Calibri" w:eastAsia="Calibri"/>
-                <w:b w:val="0"/>
-                <w:i w:val="0"/>
-                <w:color w:val="1C1917"/>
-                <w:sz w:val="18"/>
-              </w:rPr>
-              <w:t>ya</w:t>
-            </w:r>
-          </w:p>
-        </w:tc>
-      </w:tr>
-      <w:tr>
-        <w:tc>
-          <w:tcPr>
-            <w:tcW w:type="dxa" w:w="2436"/>
-            <w:tcBorders>
-              <w:top w:val="single" w:sz="4" w:color="E8E0D5"/>
-              <w:left w:val="single" w:sz="4" w:color="E8E0D5"/>
-              <w:bottom w:val="single" w:sz="4" w:color="E8E0D5"/>
-              <w:right w:val="single" w:sz="4" w:color="E8E0D5"/>
-            </w:tcBorders>
-          </w:tcPr>
-          <w:p>
-            <w:pPr>
-              <w:spacing w:after="40" w:before="40"/>
-            </w:pPr>
-            <w:r/>
-            <w:r>
-              <w:rPr>
-                <w:rFonts w:ascii="Calibri" w:hAnsi="Calibri" w:eastAsia="Calibri"/>
-                <w:b w:val="0"/>
-                <w:i w:val="0"/>
-                <w:color w:val="1C1917"/>
-                <w:sz w:val="18"/>
-              </w:rPr>
-              <w:t>17</w:t>
-            </w:r>
-          </w:p>
-        </w:tc>
-        <w:tc>
-          <w:tcPr>
-            <w:tcW w:type="dxa" w:w="2436"/>
-            <w:tcBorders>
-              <w:top w:val="single" w:sz="4" w:color="E8E0D5"/>
-              <w:left w:val="single" w:sz="4" w:color="E8E0D5"/>
-              <w:bottom w:val="single" w:sz="4" w:color="E8E0D5"/>
-              <w:right w:val="single" w:sz="4" w:color="E8E0D5"/>
-            </w:tcBorders>
-          </w:tcPr>
-          <w:p>
-            <w:pPr>
-              <w:spacing w:after="40" w:before="40"/>
-            </w:pPr>
-            <w:r/>
-            <w:r>
-              <w:rPr>
-                <w:rFonts w:ascii="Calibri" w:hAnsi="Calibri" w:eastAsia="Calibri"/>
-                <w:b w:val="0"/>
-                <w:i w:val="0"/>
-                <w:color w:val="1C1917"/>
-                <w:sz w:val="18"/>
-              </w:rPr>
-              <w:t>L1 pernah dikunci dalam keadaan kotor (masih ada kendala)?</w:t>
-            </w:r>
-          </w:p>
-        </w:tc>
-        <w:tc>
-          <w:tcPr>
-            <w:tcW w:type="dxa" w:w="2436"/>
-            <w:tcBorders>
-              <w:top w:val="single" w:sz="4" w:color="E8E0D5"/>
-              <w:left w:val="single" w:sz="4" w:color="E8E0D5"/>
-              <w:bottom w:val="single" w:sz="4" w:color="E8E0D5"/>
-              <w:right w:val="single" w:sz="4" w:color="E8E0D5"/>
-            </w:tcBorders>
-          </w:tcPr>
-          <w:p>
-            <w:pPr>
-              <w:spacing w:after="40" w:before="40"/>
-            </w:pPr>
-            <w:r/>
-            <w:r>
-              <w:rPr>
-                <w:rFonts w:ascii="Calibri" w:hAnsi="Calibri" w:eastAsia="Calibri"/>
-                <w:b w:val="0"/>
-                <w:i w:val="0"/>
-                <w:color w:val="1C1917"/>
-                <w:sz w:val="18"/>
-              </w:rPr>
-              <w:t>Ya / Tidak / Tidak sempat</w:t>
-            </w:r>
-          </w:p>
-        </w:tc>
-        <w:tc>
-          <w:tcPr>
-            <w:tcW w:type="dxa" w:w="2436"/>
-            <w:tcBorders>
-              <w:top w:val="single" w:sz="4" w:color="E8E0D5"/>
-              <w:left w:val="single" w:sz="4" w:color="E8E0D5"/>
-              <w:bottom w:val="single" w:sz="4" w:color="E8E0D5"/>
-              <w:right w:val="single" w:sz="4" w:color="E8E0D5"/>
-            </w:tcBorders>
-          </w:tcPr>
-          <w:p>
-            <w:pPr>
-              <w:spacing w:after="40" w:before="40"/>
-            </w:pPr>
-            <w:r/>
-            <w:r>
-              <w:rPr>
-                <w:rFonts w:ascii="Calibri" w:hAnsi="Calibri" w:eastAsia="Calibri"/>
-                <w:b w:val="0"/>
-                <w:i w:val="0"/>
-                <w:color w:val="1C1917"/>
-                <w:sz w:val="18"/>
-              </w:rPr>
-              <w:t>ya</w:t>
-            </w:r>
-          </w:p>
-        </w:tc>
-      </w:tr>
-      <w:tr>
-        <w:tc>
-          <w:tcPr>
-            <w:tcW w:type="dxa" w:w="2436"/>
-            <w:tcBorders>
-              <w:top w:val="single" w:sz="4" w:color="E8E0D5"/>
-              <w:left w:val="single" w:sz="4" w:color="E8E0D5"/>
-              <w:bottom w:val="single" w:sz="4" w:color="E8E0D5"/>
-              <w:right w:val="single" w:sz="4" w:color="E8E0D5"/>
-            </w:tcBorders>
-            <w:shd w:fill="F7F3EE" w:val="clear"/>
-          </w:tcPr>
-          <w:p>
-            <w:pPr>
-              <w:spacing w:after="40" w:before="40"/>
-            </w:pPr>
-            <w:r/>
-            <w:r>
-              <w:rPr>
-                <w:rFonts w:ascii="Calibri" w:hAnsi="Calibri" w:eastAsia="Calibri"/>
-                <w:b w:val="0"/>
-                <w:i w:val="0"/>
-                <w:color w:val="1C1917"/>
-                <w:sz w:val="18"/>
-              </w:rPr>
-              <w:t>18</w:t>
-            </w:r>
-          </w:p>
-        </w:tc>
-        <w:tc>
-          <w:tcPr>
-            <w:tcW w:type="dxa" w:w="2436"/>
-            <w:tcBorders>
-              <w:top w:val="single" w:sz="4" w:color="E8E0D5"/>
-              <w:left w:val="single" w:sz="4" w:color="E8E0D5"/>
-              <w:bottom w:val="single" w:sz="4" w:color="E8E0D5"/>
-              <w:right w:val="single" w:sz="4" w:color="E8E0D5"/>
-            </w:tcBorders>
-            <w:shd w:fill="F7F3EE" w:val="clear"/>
-          </w:tcPr>
-          <w:p>
-            <w:pPr>
-              <w:spacing w:after="40" w:before="40"/>
-            </w:pPr>
-            <w:r/>
-            <w:r>
-              <w:rPr>
-                <w:rFonts w:ascii="Calibri" w:hAnsi="Calibri" w:eastAsia="Calibri"/>
-                <w:b w:val="0"/>
-                <w:i w:val="0"/>
-                <w:color w:val="1C1917"/>
-                <w:sz w:val="18"/>
-              </w:rPr>
-              <w:t>Kelompok memperbaiki L1 sebelum berjanji di Weekly Work Plan?</w:t>
+              <w:t>Mutu tidak ditawar turun di Pemilihan?</w:t>
             </w:r>
           </w:p>
         </w:tc>
@@ -8221,7 +5981,7 @@
                 <w:color w:val="1C1917"/>
                 <w:sz w:val="18"/>
               </w:rPr>
-              <w:t>19</w:t>
+              <w:t>11</w:t>
             </w:r>
           </w:p>
         </w:tc>
@@ -8248,679 +6008,7 @@
                 <w:color w:val="1C1917"/>
                 <w:sz w:val="18"/>
               </w:rPr>
-              <w:t>Tombol masukkan ke jadwal dipakai untuk mengisi hari kosong dari Workable?</w:t>
-            </w:r>
-          </w:p>
-        </w:tc>
-        <w:tc>
-          <w:tcPr>
-            <w:tcW w:type="dxa" w:w="2436"/>
-            <w:tcBorders>
-              <w:top w:val="single" w:sz="4" w:color="E8E0D5"/>
-              <w:left w:val="single" w:sz="4" w:color="E8E0D5"/>
-              <w:bottom w:val="single" w:sz="4" w:color="E8E0D5"/>
-              <w:right w:val="single" w:sz="4" w:color="E8E0D5"/>
-            </w:tcBorders>
-          </w:tcPr>
-          <w:p>
-            <w:pPr>
-              <w:spacing w:after="40" w:before="40"/>
-            </w:pPr>
-            <w:r/>
-            <w:r>
-              <w:rPr>
-                <w:rFonts w:ascii="Calibri" w:hAnsi="Calibri" w:eastAsia="Calibri"/>
-                <w:b w:val="0"/>
-                <w:i w:val="0"/>
-                <w:color w:val="1C1917"/>
-                <w:sz w:val="18"/>
-              </w:rPr>
-              <w:t>Ya / Tidak / Tidak sempat</w:t>
-            </w:r>
-          </w:p>
-        </w:tc>
-        <w:tc>
-          <w:tcPr>
-            <w:tcW w:type="dxa" w:w="2436"/>
-            <w:tcBorders>
-              <w:top w:val="single" w:sz="4" w:color="E8E0D5"/>
-              <w:left w:val="single" w:sz="4" w:color="E8E0D5"/>
-              <w:bottom w:val="single" w:sz="4" w:color="E8E0D5"/>
-              <w:right w:val="single" w:sz="4" w:color="E8E0D5"/>
-            </w:tcBorders>
-          </w:tcPr>
-          <w:p>
-            <w:pPr>
-              <w:spacing w:after="40" w:before="40"/>
-            </w:pPr>
-            <w:r/>
-            <w:r>
-              <w:rPr>
-                <w:rFonts w:ascii="Calibri" w:hAnsi="Calibri" w:eastAsia="Calibri"/>
-                <w:b w:val="0"/>
-                <w:i w:val="0"/>
-                <w:color w:val="1C1917"/>
-                <w:sz w:val="18"/>
-              </w:rPr>
-              <w:t>ya</w:t>
-            </w:r>
-          </w:p>
-        </w:tc>
-      </w:tr>
-      <w:tr>
-        <w:tc>
-          <w:tcPr>
-            <w:tcW w:type="dxa" w:w="2436"/>
-            <w:tcBorders>
-              <w:top w:val="single" w:sz="4" w:color="E8E0D5"/>
-              <w:left w:val="single" w:sz="4" w:color="E8E0D5"/>
-              <w:bottom w:val="single" w:sz="4" w:color="E8E0D5"/>
-              <w:right w:val="single" w:sz="4" w:color="E8E0D5"/>
-            </w:tcBorders>
-            <w:shd w:fill="F7F3EE" w:val="clear"/>
-          </w:tcPr>
-          <w:p>
-            <w:pPr>
-              <w:spacing w:after="40" w:before="40"/>
-            </w:pPr>
-            <w:r/>
-            <w:r>
-              <w:rPr>
-                <w:rFonts w:ascii="Calibri" w:hAnsi="Calibri" w:eastAsia="Calibri"/>
-                <w:b w:val="0"/>
-                <w:i w:val="0"/>
-                <w:color w:val="1C1917"/>
-                <w:sz w:val="18"/>
-              </w:rPr>
-              <w:t>20</w:t>
-            </w:r>
-          </w:p>
-        </w:tc>
-        <w:tc>
-          <w:tcPr>
-            <w:tcW w:type="dxa" w:w="2436"/>
-            <w:tcBorders>
-              <w:top w:val="single" w:sz="4" w:color="E8E0D5"/>
-              <w:left w:val="single" w:sz="4" w:color="E8E0D5"/>
-              <w:bottom w:val="single" w:sz="4" w:color="E8E0D5"/>
-              <w:right w:val="single" w:sz="4" w:color="E8E0D5"/>
-            </w:tcBorders>
-            <w:shd w:fill="F7F3EE" w:val="clear"/>
-          </w:tcPr>
-          <w:p>
-            <w:pPr>
-              <w:spacing w:after="40" w:before="40"/>
-            </w:pPr>
-            <w:r/>
-            <w:r>
-              <w:rPr>
-                <w:rFonts w:ascii="Calibri" w:hAnsi="Calibri" w:eastAsia="Calibri"/>
-                <w:b w:val="0"/>
-                <w:i w:val="0"/>
-                <w:color w:val="1C1917"/>
-                <w:sz w:val="18"/>
-              </w:rPr>
-              <w:t>Sisa pecahan hari setelah Sabtu tidak diperlakukan sebagai gagal?</w:t>
-            </w:r>
-          </w:p>
-        </w:tc>
-        <w:tc>
-          <w:tcPr>
-            <w:tcW w:type="dxa" w:w="2436"/>
-            <w:tcBorders>
-              <w:top w:val="single" w:sz="4" w:color="E8E0D5"/>
-              <w:left w:val="single" w:sz="4" w:color="E8E0D5"/>
-              <w:bottom w:val="single" w:sz="4" w:color="E8E0D5"/>
-              <w:right w:val="single" w:sz="4" w:color="E8E0D5"/>
-            </w:tcBorders>
-            <w:shd w:fill="F7F3EE" w:val="clear"/>
-          </w:tcPr>
-          <w:p>
-            <w:pPr>
-              <w:spacing w:after="40" w:before="40"/>
-            </w:pPr>
-            <w:r/>
-            <w:r>
-              <w:rPr>
-                <w:rFonts w:ascii="Calibri" w:hAnsi="Calibri" w:eastAsia="Calibri"/>
-                <w:b w:val="0"/>
-                <w:i w:val="0"/>
-                <w:color w:val="1C1917"/>
-                <w:sz w:val="18"/>
-              </w:rPr>
-              <w:t>Ya / Tidak / Tidak sempat</w:t>
-            </w:r>
-          </w:p>
-        </w:tc>
-        <w:tc>
-          <w:tcPr>
-            <w:tcW w:type="dxa" w:w="2436"/>
-            <w:tcBorders>
-              <w:top w:val="single" w:sz="4" w:color="E8E0D5"/>
-              <w:left w:val="single" w:sz="4" w:color="E8E0D5"/>
-              <w:bottom w:val="single" w:sz="4" w:color="E8E0D5"/>
-              <w:right w:val="single" w:sz="4" w:color="E8E0D5"/>
-            </w:tcBorders>
-            <w:shd w:fill="F7F3EE" w:val="clear"/>
-          </w:tcPr>
-          <w:p>
-            <w:pPr>
-              <w:spacing w:after="40" w:before="40"/>
-            </w:pPr>
-            <w:r/>
-            <w:r>
-              <w:rPr>
-                <w:rFonts w:ascii="Calibri" w:hAnsi="Calibri" w:eastAsia="Calibri"/>
-                <w:b w:val="0"/>
-                <w:i w:val="0"/>
-                <w:color w:val="1C1917"/>
-                <w:sz w:val="18"/>
-              </w:rPr>
-              <w:t>ya</w:t>
-            </w:r>
-          </w:p>
-        </w:tc>
-      </w:tr>
-      <w:tr>
-        <w:tc>
-          <w:tcPr>
-            <w:tcW w:type="dxa" w:w="2436"/>
-            <w:tcBorders>
-              <w:top w:val="single" w:sz="4" w:color="E8E0D5"/>
-              <w:left w:val="single" w:sz="4" w:color="E8E0D5"/>
-              <w:bottom w:val="single" w:sz="4" w:color="E8E0D5"/>
-              <w:right w:val="single" w:sz="4" w:color="E8E0D5"/>
-            </w:tcBorders>
-          </w:tcPr>
-          <w:p>
-            <w:pPr>
-              <w:spacing w:after="40" w:before="40"/>
-            </w:pPr>
-            <w:r/>
-            <w:r>
-              <w:rPr>
-                <w:rFonts w:ascii="Calibri" w:hAnsi="Calibri" w:eastAsia="Calibri"/>
-                <w:b w:val="0"/>
-                <w:i w:val="0"/>
-                <w:color w:val="1C1917"/>
-                <w:sz w:val="18"/>
-              </w:rPr>
-              <w:t>21</w:t>
-            </w:r>
-          </w:p>
-        </w:tc>
-        <w:tc>
-          <w:tcPr>
-            <w:tcW w:type="dxa" w:w="2436"/>
-            <w:tcBorders>
-              <w:top w:val="single" w:sz="4" w:color="E8E0D5"/>
-              <w:left w:val="single" w:sz="4" w:color="E8E0D5"/>
-              <w:bottom w:val="single" w:sz="4" w:color="E8E0D5"/>
-              <w:right w:val="single" w:sz="4" w:color="E8E0D5"/>
-            </w:tcBorders>
-          </w:tcPr>
-          <w:p>
-            <w:pPr>
-              <w:spacing w:after="40" w:before="40"/>
-            </w:pPr>
-            <w:r/>
-            <w:r>
-              <w:rPr>
-                <w:rFonts w:ascii="Calibri" w:hAnsi="Calibri" w:eastAsia="Calibri"/>
-                <w:b w:val="0"/>
-                <w:i w:val="0"/>
-                <w:color w:val="1C1917"/>
-                <w:sz w:val="18"/>
-              </w:rPr>
-              <w:t>Alasan variansi diisi jika pekerjaan tidak selesai?</w:t>
-            </w:r>
-          </w:p>
-        </w:tc>
-        <w:tc>
-          <w:tcPr>
-            <w:tcW w:type="dxa" w:w="2436"/>
-            <w:tcBorders>
-              <w:top w:val="single" w:sz="4" w:color="E8E0D5"/>
-              <w:left w:val="single" w:sz="4" w:color="E8E0D5"/>
-              <w:bottom w:val="single" w:sz="4" w:color="E8E0D5"/>
-              <w:right w:val="single" w:sz="4" w:color="E8E0D5"/>
-            </w:tcBorders>
-          </w:tcPr>
-          <w:p>
-            <w:pPr>
-              <w:spacing w:after="40" w:before="40"/>
-            </w:pPr>
-            <w:r/>
-            <w:r>
-              <w:rPr>
-                <w:rFonts w:ascii="Calibri" w:hAnsi="Calibri" w:eastAsia="Calibri"/>
-                <w:b w:val="0"/>
-                <w:i w:val="0"/>
-                <w:color w:val="1C1917"/>
-                <w:sz w:val="18"/>
-              </w:rPr>
-              <w:t>Ya / Tidak / Tidak sempat</w:t>
-            </w:r>
-          </w:p>
-        </w:tc>
-        <w:tc>
-          <w:tcPr>
-            <w:tcW w:type="dxa" w:w="2436"/>
-            <w:tcBorders>
-              <w:top w:val="single" w:sz="4" w:color="E8E0D5"/>
-              <w:left w:val="single" w:sz="4" w:color="E8E0D5"/>
-              <w:bottom w:val="single" w:sz="4" w:color="E8E0D5"/>
-              <w:right w:val="single" w:sz="4" w:color="E8E0D5"/>
-            </w:tcBorders>
-          </w:tcPr>
-          <w:p>
-            <w:pPr>
-              <w:spacing w:after="40" w:before="40"/>
-            </w:pPr>
-            <w:r/>
-            <w:r>
-              <w:rPr>
-                <w:rFonts w:ascii="Calibri" w:hAnsi="Calibri" w:eastAsia="Calibri"/>
-                <w:b w:val="0"/>
-                <w:i w:val="0"/>
-                <w:color w:val="1C1917"/>
-                <w:sz w:val="18"/>
-              </w:rPr>
-              <w:t>ya</w:t>
-            </w:r>
-          </w:p>
-        </w:tc>
-      </w:tr>
-      <w:tr>
-        <w:tc>
-          <w:tcPr>
-            <w:tcW w:type="dxa" w:w="2436"/>
-            <w:tcBorders>
-              <w:top w:val="single" w:sz="4" w:color="E8E0D5"/>
-              <w:left w:val="single" w:sz="4" w:color="E8E0D5"/>
-              <w:bottom w:val="single" w:sz="4" w:color="E8E0D5"/>
-              <w:right w:val="single" w:sz="4" w:color="E8E0D5"/>
-            </w:tcBorders>
-            <w:shd w:fill="F7F3EE" w:val="clear"/>
-          </w:tcPr>
-          <w:p>
-            <w:pPr>
-              <w:spacing w:after="40" w:before="40"/>
-            </w:pPr>
-            <w:r/>
-            <w:r>
-              <w:rPr>
-                <w:rFonts w:ascii="Calibri" w:hAnsi="Calibri" w:eastAsia="Calibri"/>
-                <w:b w:val="0"/>
-                <w:i w:val="0"/>
-                <w:color w:val="1C1917"/>
-                <w:sz w:val="18"/>
-              </w:rPr>
-              <w:t>22</w:t>
-            </w:r>
-          </w:p>
-        </w:tc>
-        <w:tc>
-          <w:tcPr>
-            <w:tcW w:type="dxa" w:w="2436"/>
-            <w:tcBorders>
-              <w:top w:val="single" w:sz="4" w:color="E8E0D5"/>
-              <w:left w:val="single" w:sz="4" w:color="E8E0D5"/>
-              <w:bottom w:val="single" w:sz="4" w:color="E8E0D5"/>
-              <w:right w:val="single" w:sz="4" w:color="E8E0D5"/>
-            </w:tcBorders>
-            <w:shd w:fill="F7F3EE" w:val="clear"/>
-          </w:tcPr>
-          <w:p>
-            <w:pPr>
-              <w:spacing w:after="40" w:before="40"/>
-            </w:pPr>
-            <w:r/>
-            <w:r>
-              <w:rPr>
-                <w:rFonts w:ascii="Calibri" w:hAnsi="Calibri" w:eastAsia="Calibri"/>
-                <w:b w:val="0"/>
-                <w:i w:val="0"/>
-                <w:color w:val="1C1917"/>
-                <w:sz w:val="18"/>
-              </w:rPr>
-              <w:t>Kelompok membahas keandalan janji atau PPC di Learning atau Laporan?</w:t>
-            </w:r>
-          </w:p>
-        </w:tc>
-        <w:tc>
-          <w:tcPr>
-            <w:tcW w:type="dxa" w:w="2436"/>
-            <w:tcBorders>
-              <w:top w:val="single" w:sz="4" w:color="E8E0D5"/>
-              <w:left w:val="single" w:sz="4" w:color="E8E0D5"/>
-              <w:bottom w:val="single" w:sz="4" w:color="E8E0D5"/>
-              <w:right w:val="single" w:sz="4" w:color="E8E0D5"/>
-            </w:tcBorders>
-            <w:shd w:fill="F7F3EE" w:val="clear"/>
-          </w:tcPr>
-          <w:p>
-            <w:pPr>
-              <w:spacing w:after="40" w:before="40"/>
-            </w:pPr>
-            <w:r/>
-            <w:r>
-              <w:rPr>
-                <w:rFonts w:ascii="Calibri" w:hAnsi="Calibri" w:eastAsia="Calibri"/>
-                <w:b w:val="0"/>
-                <w:i w:val="0"/>
-                <w:color w:val="1C1917"/>
-                <w:sz w:val="18"/>
-              </w:rPr>
-              <w:t>Ya / Tidak / Tidak sempat</w:t>
-            </w:r>
-          </w:p>
-        </w:tc>
-        <w:tc>
-          <w:tcPr>
-            <w:tcW w:type="dxa" w:w="2436"/>
-            <w:tcBorders>
-              <w:top w:val="single" w:sz="4" w:color="E8E0D5"/>
-              <w:left w:val="single" w:sz="4" w:color="E8E0D5"/>
-              <w:bottom w:val="single" w:sz="4" w:color="E8E0D5"/>
-              <w:right w:val="single" w:sz="4" w:color="E8E0D5"/>
-            </w:tcBorders>
-            <w:shd w:fill="F7F3EE" w:val="clear"/>
-          </w:tcPr>
-          <w:p>
-            <w:pPr>
-              <w:spacing w:after="40" w:before="40"/>
-            </w:pPr>
-            <w:r/>
-            <w:r>
-              <w:rPr>
-                <w:rFonts w:ascii="Calibri" w:hAnsi="Calibri" w:eastAsia="Calibri"/>
-                <w:b w:val="0"/>
-                <w:i w:val="0"/>
-                <w:color w:val="1C1917"/>
-                <w:sz w:val="18"/>
-              </w:rPr>
-              <w:t>ya</w:t>
-            </w:r>
-          </w:p>
-        </w:tc>
-      </w:tr>
-      <w:tr>
-        <w:tc>
-          <w:tcPr>
-            <w:tcW w:type="dxa" w:w="2436"/>
-            <w:tcBorders>
-              <w:top w:val="single" w:sz="4" w:color="E8E0D5"/>
-              <w:left w:val="single" w:sz="4" w:color="E8E0D5"/>
-              <w:bottom w:val="single" w:sz="4" w:color="E8E0D5"/>
-              <w:right w:val="single" w:sz="4" w:color="E8E0D5"/>
-            </w:tcBorders>
-          </w:tcPr>
-          <w:p>
-            <w:pPr>
-              <w:spacing w:after="40" w:before="40"/>
-            </w:pPr>
-            <w:r/>
-            <w:r>
-              <w:rPr>
-                <w:rFonts w:ascii="Calibri" w:hAnsi="Calibri" w:eastAsia="Calibri"/>
-                <w:b w:val="0"/>
-                <w:i w:val="0"/>
-                <w:color w:val="1C1917"/>
-                <w:sz w:val="18"/>
-              </w:rPr>
-              <w:t>23</w:t>
-            </w:r>
-          </w:p>
-        </w:tc>
-        <w:tc>
-          <w:tcPr>
-            <w:tcW w:type="dxa" w:w="2436"/>
-            <w:tcBorders>
-              <w:top w:val="single" w:sz="4" w:color="E8E0D5"/>
-              <w:left w:val="single" w:sz="4" w:color="E8E0D5"/>
-              <w:bottom w:val="single" w:sz="4" w:color="E8E0D5"/>
-              <w:right w:val="single" w:sz="4" w:color="E8E0D5"/>
-            </w:tcBorders>
-          </w:tcPr>
-          <w:p>
-            <w:pPr>
-              <w:spacing w:after="40" w:before="40"/>
-            </w:pPr>
-            <w:r/>
-            <w:r>
-              <w:rPr>
-                <w:rFonts w:ascii="Calibri" w:hAnsi="Calibri" w:eastAsia="Calibri"/>
-                <w:b w:val="0"/>
-                <w:i w:val="0"/>
-                <w:color w:val="1C1917"/>
-                <w:sz w:val="18"/>
-              </w:rPr>
-              <w:t>Mutu tidak ditawar turun di Pemilihan?</w:t>
-            </w:r>
-          </w:p>
-        </w:tc>
-        <w:tc>
-          <w:tcPr>
-            <w:tcW w:type="dxa" w:w="2436"/>
-            <w:tcBorders>
-              <w:top w:val="single" w:sz="4" w:color="E8E0D5"/>
-              <w:left w:val="single" w:sz="4" w:color="E8E0D5"/>
-              <w:bottom w:val="single" w:sz="4" w:color="E8E0D5"/>
-              <w:right w:val="single" w:sz="4" w:color="E8E0D5"/>
-            </w:tcBorders>
-          </w:tcPr>
-          <w:p>
-            <w:pPr>
-              <w:spacing w:after="40" w:before="40"/>
-            </w:pPr>
-            <w:r/>
-            <w:r>
-              <w:rPr>
-                <w:rFonts w:ascii="Calibri" w:hAnsi="Calibri" w:eastAsia="Calibri"/>
-                <w:b w:val="0"/>
-                <w:i w:val="0"/>
-                <w:color w:val="1C1917"/>
-                <w:sz w:val="18"/>
-              </w:rPr>
-              <w:t>Ya / Tidak / Tidak sempat</w:t>
-            </w:r>
-          </w:p>
-        </w:tc>
-        <w:tc>
-          <w:tcPr>
-            <w:tcW w:type="dxa" w:w="2436"/>
-            <w:tcBorders>
-              <w:top w:val="single" w:sz="4" w:color="E8E0D5"/>
-              <w:left w:val="single" w:sz="4" w:color="E8E0D5"/>
-              <w:bottom w:val="single" w:sz="4" w:color="E8E0D5"/>
-              <w:right w:val="single" w:sz="4" w:color="E8E0D5"/>
-            </w:tcBorders>
-          </w:tcPr>
-          <w:p>
-            <w:pPr>
-              <w:spacing w:after="40" w:before="40"/>
-            </w:pPr>
-            <w:r/>
-            <w:r>
-              <w:rPr>
-                <w:rFonts w:ascii="Calibri" w:hAnsi="Calibri" w:eastAsia="Calibri"/>
-                <w:b w:val="0"/>
-                <w:i w:val="0"/>
-                <w:color w:val="1C1917"/>
-                <w:sz w:val="18"/>
-              </w:rPr>
-              <w:t>ya</w:t>
-            </w:r>
-          </w:p>
-        </w:tc>
-      </w:tr>
-      <w:tr>
-        <w:tc>
-          <w:tcPr>
-            <w:tcW w:type="dxa" w:w="2436"/>
-            <w:tcBorders>
-              <w:top w:val="single" w:sz="4" w:color="E8E0D5"/>
-              <w:left w:val="single" w:sz="4" w:color="E8E0D5"/>
-              <w:bottom w:val="single" w:sz="4" w:color="E8E0D5"/>
-              <w:right w:val="single" w:sz="4" w:color="E8E0D5"/>
-            </w:tcBorders>
-            <w:shd w:fill="F7F3EE" w:val="clear"/>
-          </w:tcPr>
-          <w:p>
-            <w:pPr>
-              <w:spacing w:after="40" w:before="40"/>
-            </w:pPr>
-            <w:r/>
-            <w:r>
-              <w:rPr>
-                <w:rFonts w:ascii="Calibri" w:hAnsi="Calibri" w:eastAsia="Calibri"/>
-                <w:b w:val="0"/>
-                <w:i w:val="0"/>
-                <w:color w:val="1C1917"/>
-                <w:sz w:val="18"/>
-              </w:rPr>
-              <w:t>24</w:t>
-            </w:r>
-          </w:p>
-        </w:tc>
-        <w:tc>
-          <w:tcPr>
-            <w:tcW w:type="dxa" w:w="2436"/>
-            <w:tcBorders>
-              <w:top w:val="single" w:sz="4" w:color="E8E0D5"/>
-              <w:left w:val="single" w:sz="4" w:color="E8E0D5"/>
-              <w:bottom w:val="single" w:sz="4" w:color="E8E0D5"/>
-              <w:right w:val="single" w:sz="4" w:color="E8E0D5"/>
-            </w:tcBorders>
-            <w:shd w:fill="F7F3EE" w:val="clear"/>
-          </w:tcPr>
-          <w:p>
-            <w:pPr>
-              <w:spacing w:after="40" w:before="40"/>
-            </w:pPr>
-            <w:r/>
-            <w:r>
-              <w:rPr>
-                <w:rFonts w:ascii="Calibri" w:hAnsi="Calibri" w:eastAsia="Calibri"/>
-                <w:b w:val="0"/>
-                <w:i w:val="0"/>
-                <w:color w:val="1C1917"/>
-                <w:sz w:val="18"/>
-              </w:rPr>
-              <w:t>Nama file JSON sesi (contoh S260825-A-G2.json)</w:t>
-            </w:r>
-          </w:p>
-        </w:tc>
-        <w:tc>
-          <w:tcPr>
-            <w:tcW w:type="dxa" w:w="2436"/>
-            <w:tcBorders>
-              <w:top w:val="single" w:sz="4" w:color="E8E0D5"/>
-              <w:left w:val="single" w:sz="4" w:color="E8E0D5"/>
-              <w:bottom w:val="single" w:sz="4" w:color="E8E0D5"/>
-              <w:right w:val="single" w:sz="4" w:color="E8E0D5"/>
-            </w:tcBorders>
-            <w:shd w:fill="F7F3EE" w:val="clear"/>
-          </w:tcPr>
-          <w:p>
-            <w:pPr>
-              <w:spacing w:after="40" w:before="40"/>
-            </w:pPr>
-            <w:r/>
-            <w:r>
-              <w:rPr>
-                <w:rFonts w:ascii="Calibri" w:hAnsi="Calibri" w:eastAsia="Calibri"/>
-                <w:b w:val="0"/>
-                <w:i w:val="0"/>
-                <w:color w:val="1C1917"/>
-                <w:sz w:val="18"/>
-              </w:rPr>
-              <w:t>isian singkat</w:t>
-            </w:r>
-          </w:p>
-        </w:tc>
-        <w:tc>
-          <w:tcPr>
-            <w:tcW w:type="dxa" w:w="2436"/>
-            <w:tcBorders>
-              <w:top w:val="single" w:sz="4" w:color="E8E0D5"/>
-              <w:left w:val="single" w:sz="4" w:color="E8E0D5"/>
-              <w:bottom w:val="single" w:sz="4" w:color="E8E0D5"/>
-              <w:right w:val="single" w:sz="4" w:color="E8E0D5"/>
-            </w:tcBorders>
-            <w:shd w:fill="F7F3EE" w:val="clear"/>
-          </w:tcPr>
-          <w:p>
-            <w:pPr>
-              <w:spacing w:after="40" w:before="40"/>
-            </w:pPr>
-            <w:r/>
-            <w:r>
-              <w:rPr>
-                <w:rFonts w:ascii="Calibri" w:hAnsi="Calibri" w:eastAsia="Calibri"/>
-                <w:b w:val="0"/>
-                <w:i w:val="0"/>
-                <w:color w:val="1C1917"/>
-                <w:sz w:val="18"/>
-              </w:rPr>
-              <w:t>tidak</w:t>
-            </w:r>
-          </w:p>
-        </w:tc>
-      </w:tr>
-      <w:tr>
-        <w:tc>
-          <w:tcPr>
-            <w:tcW w:type="dxa" w:w="2436"/>
-            <w:tcBorders>
-              <w:top w:val="single" w:sz="4" w:color="E8E0D5"/>
-              <w:left w:val="single" w:sz="4" w:color="E8E0D5"/>
-              <w:bottom w:val="single" w:sz="4" w:color="E8E0D5"/>
-              <w:right w:val="single" w:sz="4" w:color="E8E0D5"/>
-            </w:tcBorders>
-          </w:tcPr>
-          <w:p>
-            <w:pPr>
-              <w:spacing w:after="40" w:before="40"/>
-            </w:pPr>
-            <w:r/>
-            <w:r>
-              <w:rPr>
-                <w:rFonts w:ascii="Calibri" w:hAnsi="Calibri" w:eastAsia="Calibri"/>
-                <w:b w:val="0"/>
-                <w:i w:val="0"/>
-                <w:color w:val="1C1917"/>
-                <w:sz w:val="18"/>
-              </w:rPr>
-              <w:t>25</w:t>
-            </w:r>
-          </w:p>
-        </w:tc>
-        <w:tc>
-          <w:tcPr>
-            <w:tcW w:type="dxa" w:w="2436"/>
-            <w:tcBorders>
-              <w:top w:val="single" w:sz="4" w:color="E8E0D5"/>
-              <w:left w:val="single" w:sz="4" w:color="E8E0D5"/>
-              <w:bottom w:val="single" w:sz="4" w:color="E8E0D5"/>
-              <w:right w:val="single" w:sz="4" w:color="E8E0D5"/>
-            </w:tcBorders>
-          </w:tcPr>
-          <w:p>
-            <w:pPr>
-              <w:spacing w:after="40" w:before="40"/>
-            </w:pPr>
-            <w:r/>
-            <w:r>
-              <w:rPr>
-                <w:rFonts w:ascii="Calibri" w:hAnsi="Calibri" w:eastAsia="Calibri"/>
-                <w:b w:val="0"/>
-                <w:i w:val="0"/>
-                <w:color w:val="1C1917"/>
-                <w:sz w:val="18"/>
-              </w:rPr>
-              <w:t>PPC minggu 1 dalam persen, jika terlihat. Jika tidak, tulis tidak ada.</w:t>
+              <w:t>Nama file JSON yang akan dikirim ke peneliti (contoh S260901-A-G2.json). Jika belum diunduh, tulis belum.</w:t>
             </w:r>
           </w:p>
         </w:tc>
@@ -9004,7 +6092,7 @@
                 <w:color w:val="1C1917"/>
                 <w:sz w:val="18"/>
               </w:rPr>
-              <w:t>26</w:t>
+              <w:t>12</w:t>
             </w:r>
           </w:p>
         </w:tc>
@@ -9111,7 +6199,7 @@
           <w:color w:val="57534E"/>
           <w:sz w:val="20"/>
         </w:rPr>
-        <w:t>Olah: % kelompok sampai huddle (no. 13). Perilaku metode = % Ya pada 18–23; no. 17 diharapkan Tidak.</w:t>
+        <w:t>Olah: % kelompok sampai huddle (no. 8). Tab terakhir = no. 5. Perilaku metode = % Ya pada 7, 9, 10; no. 6 diharapkan Tidak. File JSON bukan tugas peserta — fasilitator mengunduh lalu mengirim email ke peneliti.</w:t>
       </w:r>
     </w:p>
     <w:p>
@@ -9141,7 +6229,7 @@
           <w:color w:val="57534E"/>
           <w:sz w:val="18"/>
         </w:rPr>
-        <w:t>SiapKerja! 1.19.1  ·  Draf kuesioner v1.3  ·  25 Agustus 2026</w:t>
+        <w:t>SiapKerja! 1.19.1  ·  Draf kuesioner v1.4  ·  25 Agustus 2026</w:t>
         <w:br/>
         <w:t>Import Forms: MSForms_01_Pra  ·  02_Pasca  ·  03_Pengamat  ·  CaraUnggah.md</w:t>
       </w:r>
@@ -9172,7 +6260,7 @@
         <w:color w:val="57534E"/>
         <w:sz w:val="16"/>
       </w:rPr>
-      <w:t>SiapKerja! 1.19.1  ·  Draf kuesioner v1.3  ·  evaluasi SiapKerja</w:t>
+      <w:t>SiapKerja! 1.19.1  ·  Draf kuesioner v1.4  ·  evaluasi SiapKerja</w:t>
     </w:r>
   </w:p>
 </w:ftr>

</xml_diff>